<commit_message>
Updated Sprint 2 user stories
</commit_message>
<xml_diff>
--- a/Documentation/Sprint 1 Deliverables/userStories.docx
+++ b/Documentation/Sprint 1 Deliverables/userStories.docx
@@ -5,7 +5,7 @@
     <w:p>
       <w:pPr>
         <w:rPr>
-          <w:rFonts w:ascii="Times New Roman" w:hAnsi="Times New Roman" w:cs="Times New Roman"/>
+          <w:rFonts w:ascii="Times New Roman" w:hAnsi="Times New Roman" w:eastAsia="Times New Roman" w:cs="Times New Roman"/>
           <w:sz w:val="36"/>
           <w:szCs w:val="36"/>
           <w:lang w:val="en-US"/>
@@ -13,7 +13,7 @@
       </w:pPr>
       <w:r>
         <w:rPr>
-          <w:rFonts w:ascii="Times New Roman" w:hAnsi="Times New Roman" w:cs="Times New Roman"/>
+          <w:rFonts w:ascii="Times New Roman" w:hAnsi="Times New Roman" w:eastAsia="Times New Roman" w:cs="Times New Roman"/>
           <w:sz w:val="36"/>
           <w:szCs w:val="36"/>
           <w:lang w:val="en-US"/>
@@ -24,19 +24,19 @@
     <w:p>
       <w:pPr>
         <w:rPr>
-          <w:rFonts w:ascii="Times New Roman" w:hAnsi="Times New Roman" w:cs="Times New Roman"/>
-          <w:lang w:val="en-US"/>
-        </w:rPr>
-      </w:pPr>
-      <w:r>
-        <w:rPr>
-          <w:rFonts w:ascii="Times New Roman" w:hAnsi="Times New Roman" w:cs="Times New Roman"/>
+          <w:rFonts w:ascii="Times New Roman" w:hAnsi="Times New Roman" w:eastAsia="Times New Roman" w:cs="Times New Roman"/>
+          <w:lang w:val="en-US"/>
+        </w:rPr>
+      </w:pPr>
+      <w:r>
+        <w:rPr>
+          <w:rFonts w:ascii="Times New Roman" w:hAnsi="Times New Roman" w:eastAsia="Times New Roman" w:cs="Times New Roman"/>
         </w:rPr>
         <w:t>The following user stories define the functionality to be developed during Sprint 2</w:t>
       </w:r>
       <w:r>
         <w:rPr>
-          <w:rFonts w:ascii="Times New Roman" w:hAnsi="Times New Roman" w:cs="Times New Roman"/>
+          <w:rFonts w:ascii="Times New Roman" w:hAnsi="Times New Roman" w:eastAsia="Times New Roman" w:cs="Times New Roman"/>
         </w:rPr>
         <w:t>.</w:t>
       </w:r>
@@ -45,13 +45,13 @@
       <w:pPr>
         <w:spacing w:after="0"/>
         <w:rPr>
-          <w:rFonts w:ascii="Times New Roman" w:hAnsi="Times New Roman" w:cs="Times New Roman"/>
-          <w:lang w:val="en-US"/>
-        </w:rPr>
-      </w:pPr>
-      <w:r>
-        <w:rPr>
-          <w:rFonts w:ascii="Times New Roman" w:hAnsi="Times New Roman" w:cs="Times New Roman"/>
+          <w:rFonts w:ascii="Times New Roman" w:hAnsi="Times New Roman" w:eastAsia="Times New Roman" w:cs="Times New Roman"/>
+          <w:lang w:val="en-US"/>
+        </w:rPr>
+      </w:pPr>
+      <w:r>
+        <w:rPr>
+          <w:rFonts w:ascii="Times New Roman" w:hAnsi="Times New Roman" w:eastAsia="Times New Roman" w:cs="Times New Roman"/>
           <w:lang w:val="en-US"/>
         </w:rPr>
         <w:t>Person Identification</w:t>
@@ -61,7 +61,7 @@
       <w:pPr>
         <w:spacing w:after="0"/>
         <w:rPr>
-          <w:rFonts w:ascii="Times New Roman" w:hAnsi="Times New Roman" w:cs="Times New Roman"/>
+          <w:rFonts w:ascii="Times New Roman" w:hAnsi="Times New Roman" w:eastAsia="Times New Roman" w:cs="Times New Roman"/>
           <w:lang w:val="en-US"/>
         </w:rPr>
       </w:pPr>
@@ -75,13 +75,13 @@
         </w:numPr>
         <w:spacing w:after="0"/>
         <w:rPr>
-          <w:rFonts w:ascii="Times New Roman" w:hAnsi="Times New Roman" w:cs="Times New Roman"/>
-          <w:lang w:val="en-US"/>
-        </w:rPr>
-      </w:pPr>
-      <w:r>
-        <w:rPr>
-          <w:rFonts w:ascii="Times New Roman" w:hAnsi="Times New Roman" w:cs="Times New Roman"/>
+          <w:rFonts w:ascii="Times New Roman" w:hAnsi="Times New Roman" w:eastAsia="Times New Roman" w:cs="Times New Roman"/>
+          <w:lang w:val="en-US"/>
+        </w:rPr>
+      </w:pPr>
+      <w:r>
+        <w:rPr>
+          <w:rFonts w:ascii="Times New Roman" w:hAnsi="Times New Roman" w:eastAsia="Times New Roman" w:cs="Times New Roman"/>
         </w:rPr>
         <w:t>As a user, I want the system to detect people in its environment so that the robot knows when someone is present.</w:t>
       </w:r>
@@ -95,30 +95,68 @@
         </w:numPr>
         <w:spacing w:after="0"/>
         <w:rPr>
-          <w:rFonts w:ascii="Times New Roman" w:hAnsi="Times New Roman" w:cs="Times New Roman"/>
-          <w:lang w:val="en-US"/>
-        </w:rPr>
-      </w:pPr>
-      <w:r>
-        <w:rPr>
-          <w:rFonts w:ascii="Times New Roman" w:hAnsi="Times New Roman" w:cs="Times New Roman"/>
-          <w:lang w:val="en-US"/>
-        </w:rPr>
-        <w:t xml:space="preserve">As a user, I want the system to identify a person so that the robot can </w:t>
-      </w:r>
-      <w:r>
-        <w:rPr>
-          <w:rFonts w:ascii="Times New Roman" w:hAnsi="Times New Roman" w:cs="Times New Roman"/>
-          <w:lang w:val="en-US"/>
-        </w:rPr>
-        <w:t>recognise</w:t>
-      </w:r>
-      <w:r>
-        <w:rPr>
-          <w:rFonts w:ascii="Times New Roman" w:hAnsi="Times New Roman" w:cs="Times New Roman"/>
-          <w:lang w:val="en-US"/>
-        </w:rPr>
-        <w:t xml:space="preserve"> who it is interacting with.</w:t>
+          <w:rFonts w:ascii="Times New Roman" w:hAnsi="Times New Roman" w:eastAsia="Times New Roman" w:cs="Times New Roman"/>
+          <w:noProof w:val="0"/>
+          <w:color w:val="000000" w:themeColor="text1" w:themeTint="FF" w:themeShade="FF"/>
+          <w:sz w:val="24"/>
+          <w:szCs w:val="24"/>
+          <w:lang w:val="en-US"/>
+        </w:rPr>
+      </w:pPr>
+      <w:r>
+        <w:rPr>
+          <w:rFonts w:ascii="Times New Roman" w:hAnsi="Times New Roman" w:eastAsia="Times New Roman" w:cs="Times New Roman"/>
+          <w:noProof w:val="0"/>
+          <w:color w:val="000000" w:themeColor="text1" w:themeTint="FF" w:themeShade="FF"/>
+          <w:sz w:val="24"/>
+          <w:szCs w:val="24"/>
+          <w:lang w:val="en-US"/>
+        </w:rPr>
+        <w:t xml:space="preserve">As a user, I want the system to </w:t>
+      </w:r>
+      <w:r>
+        <w:rPr>
+          <w:rFonts w:ascii="Times New Roman" w:hAnsi="Times New Roman" w:eastAsia="Times New Roman" w:cs="Times New Roman"/>
+          <w:noProof w:val="0"/>
+          <w:color w:val="000000" w:themeColor="text1" w:themeTint="FF" w:themeShade="FF"/>
+          <w:sz w:val="24"/>
+          <w:szCs w:val="24"/>
+          <w:lang w:val="en-US"/>
+        </w:rPr>
+        <w:t xml:space="preserve">be able to </w:t>
+      </w:r>
+      <w:r>
+        <w:rPr>
+          <w:rFonts w:ascii="Times New Roman" w:hAnsi="Times New Roman" w:eastAsia="Times New Roman" w:cs="Times New Roman"/>
+          <w:noProof w:val="0"/>
+          <w:color w:val="000000" w:themeColor="text1" w:themeTint="FF" w:themeShade="FF"/>
+          <w:sz w:val="24"/>
+          <w:szCs w:val="24"/>
+          <w:lang w:val="en-US"/>
+        </w:rPr>
+        <w:t>identify one specific person from a group so that the robot ca</w:t>
+      </w:r>
+      <w:r>
+        <w:rPr>
+          <w:rFonts w:ascii="Times New Roman" w:hAnsi="Times New Roman" w:eastAsia="Times New Roman" w:cs="Times New Roman"/>
+          <w:noProof w:val="0"/>
+          <w:color w:val="000000" w:themeColor="text1" w:themeTint="FF" w:themeShade="FF"/>
+          <w:sz w:val="24"/>
+          <w:szCs w:val="24"/>
+          <w:lang w:val="en-US"/>
+        </w:rPr>
+        <w:t>n recogni</w:t>
+      </w:r>
+      <w:r>
+        <w:rPr>
+          <w:rFonts w:ascii="Times New Roman" w:hAnsi="Times New Roman" w:eastAsia="Times New Roman" w:cs="Times New Roman"/>
+          <w:noProof w:val="0"/>
+          <w:color w:val="000000" w:themeColor="text1" w:themeTint="FF" w:themeShade="FF"/>
+          <w:sz w:val="24"/>
+          <w:szCs w:val="24"/>
+          <w:lang w:val="en-US"/>
+        </w:rPr>
+        <w:t>se who it should interact with.</w:t>
       </w:r>
     </w:p>
     <w:p>
@@ -130,15 +168,21 @@
         </w:numPr>
         <w:spacing w:after="0"/>
         <w:rPr>
-          <w:rFonts w:ascii="Times New Roman" w:hAnsi="Times New Roman" w:cs="Times New Roman"/>
-          <w:lang w:val="en-US"/>
-        </w:rPr>
-      </w:pPr>
-      <w:r>
-        <w:rPr>
-          <w:rFonts w:ascii="Times New Roman" w:hAnsi="Times New Roman" w:cs="Times New Roman"/>
-        </w:rPr>
-        <w:t>As a developer, I want detected people to be shown with bounding boxes so that I can check whether the system is detecting people correctly.</w:t>
+          <w:rFonts w:ascii="Times New Roman" w:hAnsi="Times New Roman" w:eastAsia="Times New Roman" w:cs="Times New Roman"/>
+          <w:lang w:val="en-US"/>
+        </w:rPr>
+      </w:pPr>
+      <w:r>
+        <w:rPr>
+          <w:rFonts w:ascii="Times New Roman" w:hAnsi="Times New Roman" w:eastAsia="Times New Roman" w:cs="Times New Roman"/>
+        </w:rPr>
+        <w:t>As a developer, I want detected people to be shown with bounding boxes so that I can c</w:t>
+      </w:r>
+      <w:r>
+        <w:rPr>
+          <w:rFonts w:ascii="Times New Roman" w:hAnsi="Times New Roman" w:eastAsia="Times New Roman" w:cs="Times New Roman"/>
+        </w:rPr>
+        <w:t>heck whether the system is detecting people correctly.</w:t>
       </w:r>
     </w:p>
     <w:p>
@@ -150,47 +194,147 @@
         </w:numPr>
         <w:spacing w:after="0"/>
         <w:rPr>
-          <w:rFonts w:ascii="Times New Roman" w:hAnsi="Times New Roman" w:cs="Times New Roman"/>
-          <w:lang w:val="en-US"/>
-        </w:rPr>
-      </w:pPr>
-      <w:r>
-        <w:rPr>
-          <w:rFonts w:ascii="Times New Roman" w:hAnsi="Times New Roman" w:cs="Times New Roman"/>
-        </w:rPr>
-        <w:t>As a user, I want the system to identify the person wearing the specified clothing colour so that the robot can distinguish them from other people nearby.</w:t>
+          <w:rFonts w:ascii="Times New Roman" w:hAnsi="Times New Roman" w:eastAsia="Times New Roman" w:cs="Times New Roman"/>
+          <w:b w:val="0"/>
+          <w:bCs w:val="0"/>
+          <w:i w:val="0"/>
+          <w:iCs w:val="0"/>
+          <w:noProof w:val="0"/>
+          <w:color w:val="000000" w:themeColor="text1" w:themeTint="FF" w:themeShade="FF"/>
+          <w:sz w:val="24"/>
+          <w:szCs w:val="24"/>
+          <w:lang w:val="en-GB"/>
+        </w:rPr>
+      </w:pPr>
+      <w:r>
+        <w:rPr>
+          <w:rFonts w:ascii="Times New Roman" w:hAnsi="Times New Roman" w:eastAsia="Times New Roman" w:cs="Times New Roman"/>
+          <w:b w:val="0"/>
+          <w:bCs w:val="0"/>
+          <w:i w:val="0"/>
+          <w:iCs w:val="0"/>
+          <w:noProof w:val="0"/>
+          <w:color w:val="000000" w:themeColor="text1" w:themeTint="FF" w:themeShade="FF"/>
+          <w:sz w:val="24"/>
+          <w:szCs w:val="24"/>
+          <w:lang w:val="en-GB"/>
+        </w:rPr>
+        <w:t>As a developer, I want the system to extract body landmark coordinates from detected people so that their movements can be represented accurately.</w:t>
       </w:r>
     </w:p>
     <w:p>
       <w:pPr>
+        <w:pStyle w:val="ListParagraph"/>
+        <w:numPr>
+          <w:ilvl w:val="0"/>
+          <w:numId w:val="1"/>
+        </w:numPr>
         <w:spacing w:after="0"/>
         <w:rPr>
-          <w:rFonts w:ascii="Times New Roman" w:hAnsi="Times New Roman" w:cs="Times New Roman"/>
-          <w:lang w:val="en-US"/>
-        </w:rPr>
-      </w:pPr>
+          <w:rFonts w:ascii="Times New Roman" w:hAnsi="Times New Roman" w:eastAsia="Times New Roman" w:cs="Times New Roman"/>
+        </w:rPr>
+      </w:pPr>
+      <w:r>
+        <w:rPr>
+          <w:rFonts w:ascii="Times New Roman" w:hAnsi="Times New Roman" w:eastAsia="Times New Roman" w:cs="Times New Roman"/>
+        </w:rPr>
+        <w:t xml:space="preserve">As a user, I want the system to </w:t>
+      </w:r>
+      <w:r>
+        <w:rPr>
+          <w:rFonts w:ascii="Times New Roman" w:hAnsi="Times New Roman" w:eastAsia="Times New Roman" w:cs="Times New Roman"/>
+        </w:rPr>
+        <w:t>identify</w:t>
+      </w:r>
+      <w:r>
+        <w:rPr>
+          <w:rFonts w:ascii="Times New Roman" w:hAnsi="Times New Roman" w:eastAsia="Times New Roman" w:cs="Times New Roman"/>
+        </w:rPr>
+        <w:t xml:space="preserve"> the </w:t>
+      </w:r>
+      <w:r>
+        <w:rPr>
+          <w:rFonts w:ascii="Times New Roman" w:hAnsi="Times New Roman" w:eastAsia="Times New Roman" w:cs="Times New Roman"/>
+        </w:rPr>
+        <w:t xml:space="preserve">target </w:t>
+      </w:r>
+      <w:r>
+        <w:rPr>
+          <w:rFonts w:ascii="Times New Roman" w:hAnsi="Times New Roman" w:eastAsia="Times New Roman" w:cs="Times New Roman"/>
+        </w:rPr>
+        <w:t xml:space="preserve">person </w:t>
+      </w:r>
+      <w:r>
+        <w:rPr>
+          <w:rFonts w:ascii="Times New Roman" w:hAnsi="Times New Roman" w:eastAsia="Times New Roman" w:cs="Times New Roman"/>
+          <w:noProof w:val="0"/>
+          <w:color w:val="000000" w:themeColor="text1" w:themeTint="FF" w:themeShade="FF"/>
+          <w:lang w:val="en-US"/>
+        </w:rPr>
+        <w:t>using a unique visual identifier so that the robot can recognise them</w:t>
+      </w:r>
+      <w:r>
+        <w:rPr>
+          <w:rFonts w:ascii="Times New Roman" w:hAnsi="Times New Roman" w:eastAsia="Times New Roman" w:cs="Times New Roman"/>
+        </w:rPr>
+        <w:t xml:space="preserve"> from other people nearby.</w:t>
+      </w:r>
     </w:p>
     <w:p>
       <w:pPr>
+        <w:pStyle w:val="ListParagraph"/>
+        <w:numPr>
+          <w:ilvl w:val="0"/>
+          <w:numId w:val="1"/>
+        </w:numPr>
         <w:spacing w:after="0"/>
         <w:rPr>
-          <w:rFonts w:ascii="Times New Roman" w:hAnsi="Times New Roman" w:cs="Times New Roman"/>
-          <w:lang w:val="en-US"/>
-        </w:rPr>
-      </w:pPr>
-      <w:r>
-        <w:rPr>
-          <w:rFonts w:ascii="Times New Roman" w:hAnsi="Times New Roman" w:cs="Times New Roman"/>
-          <w:lang w:val="en-US"/>
-        </w:rPr>
-        <w:t>Gesture Recognition</w:t>
+          <w:rFonts w:ascii="Times New Roman" w:hAnsi="Times New Roman" w:eastAsia="Times New Roman" w:cs="Times New Roman"/>
+          <w:noProof w:val="0"/>
+          <w:color w:val="000000" w:themeColor="text1" w:themeTint="FF" w:themeShade="FF"/>
+          <w:lang w:val="en-GB"/>
+        </w:rPr>
+      </w:pPr>
+      <w:r>
+        <w:rPr>
+          <w:rFonts w:ascii="Times New Roman" w:hAnsi="Times New Roman" w:eastAsia="Times New Roman" w:cs="Times New Roman"/>
+          <w:noProof w:val="0"/>
+          <w:color w:val="000000" w:themeColor="text1" w:themeTint="FF" w:themeShade="FF"/>
+          <w:lang w:val="en-GB"/>
+        </w:rPr>
+        <w:t>As a user, I want the system to identify people from a live camera feed so that people can be detected as they appear in the robot's environment.</w:t>
       </w:r>
     </w:p>
     <w:p>
       <w:pPr>
         <w:spacing w:after="0"/>
         <w:rPr>
-          <w:rFonts w:ascii="Times New Roman" w:hAnsi="Times New Roman" w:cs="Times New Roman"/>
+          <w:rFonts w:ascii="Times New Roman" w:hAnsi="Times New Roman" w:eastAsia="Times New Roman" w:cs="Times New Roman"/>
+          <w:lang w:val="en-US"/>
+        </w:rPr>
+      </w:pPr>
+    </w:p>
+    <w:p>
+      <w:pPr>
+        <w:spacing w:after="0"/>
+        <w:rPr>
+          <w:rFonts w:ascii="Times New Roman" w:hAnsi="Times New Roman" w:eastAsia="Times New Roman" w:cs="Times New Roman"/>
+          <w:lang w:val="en-US"/>
+        </w:rPr>
+      </w:pPr>
+      <w:r>
+        <w:rPr>
+          <w:rFonts w:ascii="Times New Roman" w:hAnsi="Times New Roman" w:eastAsia="Times New Roman" w:cs="Times New Roman"/>
+          <w:lang w:val="en-US"/>
+        </w:rPr>
+        <w:t>Gesture Recognition</w:t>
+      </w:r>
+    </w:p>
+    <w:p>
+      <w:pPr>
+        <w:spacing w:after="0"/>
+        <w:rPr>
+          <w:rFonts w:ascii="Times New Roman" w:hAnsi="Times New Roman" w:eastAsia="Times New Roman" w:cs="Times New Roman"/>
           <w:lang w:val="en-US"/>
         </w:rPr>
       </w:pPr>
@@ -204,34 +348,34 @@
         </w:numPr>
         <w:spacing w:after="0"/>
         <w:rPr>
-          <w:rFonts w:ascii="Times New Roman" w:hAnsi="Times New Roman" w:cs="Times New Roman"/>
-          <w:lang w:val="en-US"/>
-        </w:rPr>
-      </w:pPr>
-      <w:r>
-        <w:rPr>
-          <w:rFonts w:ascii="Times New Roman" w:hAnsi="Times New Roman" w:cs="Times New Roman"/>
+          <w:rFonts w:ascii="Times New Roman" w:hAnsi="Times New Roman" w:eastAsia="Times New Roman" w:cs="Times New Roman"/>
+          <w:lang w:val="en-US"/>
+        </w:rPr>
+      </w:pPr>
+      <w:r>
+        <w:rPr>
+          <w:rFonts w:ascii="Times New Roman" w:hAnsi="Times New Roman" w:eastAsia="Times New Roman" w:cs="Times New Roman"/>
           <w:lang w:val="en-US"/>
         </w:rPr>
         <w:t>As a user, I want the system to detect my hand gestures so that the</w:t>
       </w:r>
       <w:r>
         <w:rPr>
-          <w:rFonts w:ascii="Times New Roman" w:hAnsi="Times New Roman" w:cs="Times New Roman"/>
+          <w:rFonts w:ascii="Times New Roman" w:hAnsi="Times New Roman" w:eastAsia="Times New Roman" w:cs="Times New Roman"/>
           <w:lang w:val="en-US"/>
         </w:rPr>
         <w:t xml:space="preserve"> robot can respond</w:t>
       </w:r>
       <w:r>
         <w:rPr>
-          <w:rFonts w:ascii="Times New Roman" w:hAnsi="Times New Roman" w:cs="Times New Roman"/>
+          <w:rFonts w:ascii="Times New Roman" w:hAnsi="Times New Roman" w:eastAsia="Times New Roman" w:cs="Times New Roman"/>
           <w:lang w:val="en-US"/>
         </w:rPr>
         <w:t xml:space="preserve"> </w:t>
       </w:r>
       <w:r>
         <w:rPr>
-          <w:rFonts w:ascii="Times New Roman" w:hAnsi="Times New Roman" w:cs="Times New Roman"/>
+          <w:rFonts w:ascii="Times New Roman" w:hAnsi="Times New Roman" w:eastAsia="Times New Roman" w:cs="Times New Roman"/>
           <w:lang w:val="en-US"/>
         </w:rPr>
         <w:t>to my movements.</w:t>
@@ -246,72 +390,46 @@
         </w:numPr>
         <w:spacing w:after="0"/>
         <w:rPr>
-          <w:rFonts w:ascii="Times New Roman" w:hAnsi="Times New Roman" w:cs="Times New Roman"/>
-          <w:lang w:val="en-US"/>
-        </w:rPr>
-      </w:pPr>
-      <w:r>
-        <w:rPr>
-          <w:rFonts w:ascii="Times New Roman" w:hAnsi="Times New Roman" w:cs="Times New Roman"/>
-          <w:lang w:val="en-US"/>
-        </w:rPr>
-        <w:t xml:space="preserve">⁠As a user, I want the system to </w:t>
-      </w:r>
-      <w:r>
-        <w:rPr>
-          <w:rFonts w:ascii="Times New Roman" w:hAnsi="Times New Roman" w:cs="Times New Roman"/>
-          <w:lang w:val="en-US"/>
-        </w:rPr>
-        <w:t>recogni</w:t>
-      </w:r>
-      <w:r>
-        <w:rPr>
-          <w:rFonts w:ascii="Times New Roman" w:hAnsi="Times New Roman" w:cs="Times New Roman"/>
-          <w:lang w:val="en-US"/>
-        </w:rPr>
-        <w:t>s</w:t>
-      </w:r>
-      <w:r>
-        <w:rPr>
-          <w:rFonts w:ascii="Times New Roman" w:hAnsi="Times New Roman" w:cs="Times New Roman"/>
-          <w:lang w:val="en-US"/>
-        </w:rPr>
-        <w:t>e</w:t>
-      </w:r>
-      <w:r>
-        <w:rPr>
-          <w:rFonts w:ascii="Times New Roman" w:hAnsi="Times New Roman" w:cs="Times New Roman"/>
-          <w:lang w:val="en-US"/>
-        </w:rPr>
-        <w:t xml:space="preserve"> </w:t>
-      </w:r>
-      <w:r>
-        <w:rPr>
-          <w:rFonts w:ascii="Times New Roman" w:hAnsi="Times New Roman" w:cs="Times New Roman"/>
-          <w:lang w:val="en-US"/>
-        </w:rPr>
-        <w:t xml:space="preserve">different </w:t>
-      </w:r>
-      <w:r>
-        <w:rPr>
-          <w:rFonts w:ascii="Times New Roman" w:hAnsi="Times New Roman" w:cs="Times New Roman"/>
-          <w:lang w:val="en-US"/>
-        </w:rPr>
-        <w:t xml:space="preserve">predefined hand gestures so that I </w:t>
-      </w:r>
-      <w:r>
-        <w:rPr>
-          <w:rFonts w:ascii="Times New Roman" w:hAnsi="Times New Roman" w:cs="Times New Roman"/>
-          <w:lang w:val="en-US"/>
-        </w:rPr>
-        <w:t xml:space="preserve">can give the robot instructions </w:t>
-      </w:r>
-      <w:r>
-        <w:rPr>
-          <w:rFonts w:ascii="Times New Roman" w:hAnsi="Times New Roman" w:cs="Times New Roman"/>
-          <w:lang w:val="en-US"/>
-        </w:rPr>
-        <w:t>using gestures.</w:t>
+          <w:rFonts w:ascii="Times New Roman" w:hAnsi="Times New Roman" w:eastAsia="Times New Roman" w:cs="Times New Roman"/>
+          <w:noProof w:val="0"/>
+          <w:color w:val="000000" w:themeColor="text1" w:themeTint="FF" w:themeShade="FF"/>
+          <w:sz w:val="24"/>
+          <w:szCs w:val="24"/>
+          <w:lang w:val="en-GB"/>
+        </w:rPr>
+      </w:pPr>
+      <w:r>
+        <w:rPr>
+          <w:rFonts w:ascii="Times New Roman" w:hAnsi="Times New Roman" w:eastAsia="Times New Roman" w:cs="Times New Roman"/>
+          <w:noProof w:val="0"/>
+          <w:color w:val="000000" w:themeColor="text1" w:themeTint="FF" w:themeShade="FF"/>
+          <w:sz w:val="24"/>
+          <w:szCs w:val="24"/>
+          <w:lang w:val="en-US"/>
+        </w:rPr>
+        <w:t xml:space="preserve">As a user, I want the system to </w:t>
+      </w:r>
+      <w:r>
+        <w:rPr>
+          <w:rFonts w:ascii="Times New Roman" w:hAnsi="Times New Roman" w:eastAsia="Times New Roman" w:cs="Times New Roman"/>
+          <w:noProof w:val="0"/>
+          <w:color w:val="000000" w:themeColor="text1" w:themeTint="FF" w:themeShade="FF"/>
+          <w:sz w:val="24"/>
+          <w:szCs w:val="24"/>
+          <w:lang w:val="en-US"/>
+        </w:rPr>
+        <w:t>recognise</w:t>
+      </w:r>
+      <w:r>
+        <w:rPr>
+          <w:rFonts w:ascii="Times New Roman" w:hAnsi="Times New Roman" w:eastAsia="Times New Roman" w:cs="Times New Roman"/>
+          <w:noProof w:val="0"/>
+          <w:color w:val="000000" w:themeColor="text1" w:themeTint="FF" w:themeShade="FF"/>
+          <w:sz w:val="24"/>
+          <w:szCs w:val="24"/>
+          <w:lang w:val="en-US"/>
+        </w:rPr>
+        <w:t xml:space="preserve"> at least seven predefined gestures so that I can give the robot a variety of instructions using gestures.</w:t>
       </w:r>
     </w:p>
     <w:p>
@@ -323,13 +441,13 @@
         </w:numPr>
         <w:spacing w:after="0"/>
         <w:rPr>
-          <w:rFonts w:ascii="Times New Roman" w:hAnsi="Times New Roman" w:cs="Times New Roman"/>
-          <w:lang w:val="en-US"/>
-        </w:rPr>
-      </w:pPr>
-      <w:r>
-        <w:rPr>
-          <w:rFonts w:ascii="Times New Roman" w:hAnsi="Times New Roman" w:cs="Times New Roman"/>
+          <w:rFonts w:ascii="Times New Roman" w:hAnsi="Times New Roman" w:eastAsia="Times New Roman" w:cs="Times New Roman"/>
+          <w:lang w:val="en-US"/>
+        </w:rPr>
+      </w:pPr>
+      <w:r>
+        <w:rPr>
+          <w:rFonts w:ascii="Times New Roman" w:hAnsi="Times New Roman" w:eastAsia="Times New Roman" w:cs="Times New Roman"/>
         </w:rPr>
         <w:t>As a developer, I want recognised gestures to be displayed with their frame number so that I can check whether gestures are being recognised correctly.</w:t>
       </w:r>
@@ -343,31 +461,31 @@
         </w:numPr>
         <w:spacing w:after="0"/>
         <w:rPr>
-          <w:rFonts w:ascii="Times New Roman" w:hAnsi="Times New Roman" w:cs="Times New Roman"/>
-          <w:lang w:val="en-US"/>
-        </w:rPr>
-      </w:pPr>
-      <w:r>
-        <w:rPr>
-          <w:rFonts w:ascii="Times New Roman" w:hAnsi="Times New Roman" w:cs="Times New Roman"/>
+          <w:rFonts w:ascii="Times New Roman" w:hAnsi="Times New Roman" w:eastAsia="Times New Roman" w:cs="Times New Roman"/>
+          <w:lang w:val="en-US"/>
+        </w:rPr>
+      </w:pPr>
+      <w:r>
+        <w:rPr>
+          <w:rFonts w:ascii="Times New Roman" w:hAnsi="Times New Roman" w:eastAsia="Times New Roman" w:cs="Times New Roman"/>
         </w:rPr>
         <w:t xml:space="preserve">As a user, I want the system to distinguish between normal hand movements and </w:t>
       </w:r>
       <w:r>
         <w:rPr>
-          <w:rFonts w:ascii="Times New Roman" w:hAnsi="Times New Roman" w:cs="Times New Roman"/>
+          <w:rFonts w:ascii="Times New Roman" w:hAnsi="Times New Roman" w:eastAsia="Times New Roman" w:cs="Times New Roman"/>
         </w:rPr>
         <w:t xml:space="preserve">intended </w:t>
       </w:r>
       <w:r>
         <w:rPr>
-          <w:rFonts w:ascii="Times New Roman" w:hAnsi="Times New Roman" w:cs="Times New Roman"/>
+          <w:rFonts w:ascii="Times New Roman" w:hAnsi="Times New Roman" w:eastAsia="Times New Roman" w:cs="Times New Roman"/>
         </w:rPr>
         <w:t xml:space="preserve">gestures </w:t>
       </w:r>
       <w:r>
         <w:rPr>
-          <w:rFonts w:ascii="Times New Roman" w:hAnsi="Times New Roman" w:cs="Times New Roman"/>
+          <w:rFonts w:ascii="Times New Roman" w:hAnsi="Times New Roman" w:eastAsia="Times New Roman" w:cs="Times New Roman"/>
         </w:rPr>
         <w:t>so that the robot only responds to actual commands.</w:t>
       </w:r>
@@ -376,13 +494,43 @@
       <w:pPr>
         <w:ind w:left="360"/>
         <w:rPr>
+          <w:rFonts w:ascii="Times New Roman" w:hAnsi="Times New Roman" w:eastAsia="Times New Roman" w:cs="Times New Roman"/>
+          <w:lang w:val="en-US"/>
+        </w:rPr>
+      </w:pPr>
+    </w:p>
+    <w:p>
+      <w:pPr>
+        <w:pStyle w:val="ListParagraph"/>
+        <w:ind w:left="720"/>
+        <w:rPr>
+          <w:rFonts w:ascii="-webkit-standard" w:hAnsi="-webkit-standard" w:eastAsia="-webkit-standard" w:cs="-webkit-standard"/>
+          <w:b w:val="0"/>
+          <w:bCs w:val="0"/>
+          <w:i w:val="0"/>
+          <w:iCs w:val="0"/>
+          <w:noProof w:val="0"/>
+          <w:color w:val="000000" w:themeColor="text1" w:themeTint="FF" w:themeShade="FF"/>
+          <w:sz w:val="24"/>
+          <w:szCs w:val="24"/>
+          <w:lang w:val="en-GB"/>
+        </w:rPr>
+      </w:pPr>
+      <w:r>
+        <w:br/>
+      </w:r>
+    </w:p>
+    <w:p>
+      <w:pPr>
+        <w:ind w:left="360"/>
+        <w:rPr>
           <w:rFonts w:ascii="Times New Roman" w:hAnsi="Times New Roman" w:cs="Times New Roman"/>
           <w:lang w:val="en-US"/>
         </w:rPr>
       </w:pPr>
     </w:p>
     <w:sectPr>
-      <w:pgSz w:w="11906" w:h="16838"/>
+      <w:pgSz w:w="11906" w:h="16838" w:orient="portrait"/>
       <w:pgMar w:top="1440" w:right="1440" w:bottom="1440" w:left="1440" w:header="708" w:footer="708" w:gutter="0"/>
       <w:cols w:space="708"/>
       <w:docGrid w:linePitch="360"/>
@@ -393,6 +541,179 @@
 
 <file path=word/numbering.xml><?xml version="1.0" encoding="utf-8"?>
 <w:numbering xmlns:wpc="http://schemas.microsoft.com/office/word/2010/wordprocessingCanvas" xmlns:cx="http://schemas.microsoft.com/office/drawing/2014/chartex" xmlns:cx1="http://schemas.microsoft.com/office/drawing/2015/9/8/chartex" xmlns:cx2="http://schemas.microsoft.com/office/drawing/2015/10/21/chartex" xmlns:cx3="http://schemas.microsoft.com/office/drawing/2016/5/9/chartex" xmlns:cx4="http://schemas.microsoft.com/office/drawing/2016/5/10/chartex" xmlns:cx5="http://schemas.microsoft.com/office/drawing/2016/5/11/chartex" xmlns:cx6="http://schemas.microsoft.com/office/drawing/2016/5/12/chartex" xmlns:cx7="http://schemas.microsoft.com/office/drawing/2016/5/13/chartex" xmlns:cx8="http://schemas.microsoft.com/office/drawing/2016/5/14/chartex" xmlns:mc="http://schemas.openxmlformats.org/markup-compatibility/2006" xmlns:m="http://schemas.openxmlformats.org/officeDocument/2006/math" xmlns:aink="http://schemas.microsoft.com/office/drawing/2016/ink" xmlns:am3d="http://schemas.microsoft.com/office/drawing/2017/model3d" xmlns:oel="http://schemas.microsoft.com/office/2019/extlst" xmlns:r="http://schemas.openxmlformats.org/officeDocument/2006/relationships" xmlns:wp14="http://schemas.microsoft.com/office/word/2010/wordprocessingDrawing" xmlns:wp="http://schemas.openxmlformats.org/drawingml/2006/wordprocessingDrawing" xmlns:wpg="http://schemas.microsoft.com/office/word/2010/wordprocessingGroup" xmlns:wpi="http://schemas.microsoft.com/office/word/2010/wordprocessingInk" xmlns:wps="http://schemas.microsoft.com/office/word/2010/wordprocessingShape" xmlns:o="urn:schemas-microsoft-com:office:office" xmlns:v="urn:schemas-microsoft-com:vml" xmlns:w10="urn:schemas-microsoft-com:office:word" xmlns:w="http://schemas.openxmlformats.org/wordprocessingml/2006/main" xmlns:w14="http://schemas.microsoft.com/office/word/2010/wordml" xmlns:w15="http://schemas.microsoft.com/office/word/2012/wordml" xmlns:w16cex="http://schemas.microsoft.com/office/word/2018/wordml/cex" xmlns:w16cid="http://schemas.microsoft.com/office/word/2016/wordml/cid" xmlns:w16="http://schemas.microsoft.com/office/word/2018/wordml" xmlns:w16sdtdh="http://schemas.microsoft.com/office/word/2020/wordml/sdtdatahash" xmlns:w16sdtfl="http://schemas.microsoft.com/office/word/2024/wordml/sdtformatlock" xmlns:w16se="http://schemas.microsoft.com/office/word/2015/wordml/symex" xmlns:w16du="http://schemas.microsoft.com/office/word/2023/wordml/word16du" xmlns:wne="http://schemas.microsoft.com/office/word/2006/wordml" mc:Ignorable="w14 w15 w16se w16cid w16 w16cex w16sdtdh w16sdtfl w16du wp14">
+  <w:abstractNum xmlns:w="http://schemas.openxmlformats.org/wordprocessingml/2006/main" w:abstractNumId="3">
+    <w:nsid w:val="7472a116"/>
+    <w:multiLevelType xmlns:w="http://schemas.openxmlformats.org/wordprocessingml/2006/main" w:val="hybridMultilevel"/>
+    <w:lvl xmlns:w="http://schemas.openxmlformats.org/wordprocessingml/2006/main" w:ilvl="0">
+      <w:start w:val="5"/>
+      <w:numFmt w:val="decimal"/>
+      <w:lvlText w:val="%1."/>
+      <w:lvlJc w:val="left"/>
+      <w:pPr>
+        <w:ind w:left="720" w:hanging="360"/>
+      </w:pPr>
+      <w:rPr>
+        <w:rFonts w:hint="default" w:ascii="Times New Roman" w:hAnsi="Times New Roman"/>
+      </w:rPr>
+    </w:lvl>
+    <w:lvl xmlns:w="http://schemas.openxmlformats.org/wordprocessingml/2006/main" w:ilvl="1">
+      <w:start w:val="1"/>
+      <w:numFmt w:val="lowerLetter"/>
+      <w:lvlText w:val="%2."/>
+      <w:lvlJc w:val="left"/>
+      <w:pPr>
+        <w:ind w:left="1440" w:hanging="360"/>
+      </w:pPr>
+    </w:lvl>
+    <w:lvl xmlns:w="http://schemas.openxmlformats.org/wordprocessingml/2006/main" w:ilvl="2">
+      <w:start w:val="1"/>
+      <w:numFmt w:val="lowerRoman"/>
+      <w:lvlText w:val="%3."/>
+      <w:lvlJc w:val="right"/>
+      <w:pPr>
+        <w:ind w:left="2160" w:hanging="180"/>
+      </w:pPr>
+    </w:lvl>
+    <w:lvl xmlns:w="http://schemas.openxmlformats.org/wordprocessingml/2006/main" w:ilvl="3">
+      <w:start w:val="1"/>
+      <w:numFmt w:val="decimal"/>
+      <w:lvlText w:val="%4."/>
+      <w:lvlJc w:val="left"/>
+      <w:pPr>
+        <w:ind w:left="2880" w:hanging="360"/>
+      </w:pPr>
+    </w:lvl>
+    <w:lvl xmlns:w="http://schemas.openxmlformats.org/wordprocessingml/2006/main" w:ilvl="4">
+      <w:start w:val="1"/>
+      <w:numFmt w:val="lowerLetter"/>
+      <w:lvlText w:val="%5."/>
+      <w:lvlJc w:val="left"/>
+      <w:pPr>
+        <w:ind w:left="3600" w:hanging="360"/>
+      </w:pPr>
+    </w:lvl>
+    <w:lvl xmlns:w="http://schemas.openxmlformats.org/wordprocessingml/2006/main" w:ilvl="5">
+      <w:start w:val="1"/>
+      <w:numFmt w:val="lowerRoman"/>
+      <w:lvlText w:val="%6."/>
+      <w:lvlJc w:val="right"/>
+      <w:pPr>
+        <w:ind w:left="4320" w:hanging="180"/>
+      </w:pPr>
+    </w:lvl>
+    <w:lvl xmlns:w="http://schemas.openxmlformats.org/wordprocessingml/2006/main" w:ilvl="6">
+      <w:start w:val="1"/>
+      <w:numFmt w:val="decimal"/>
+      <w:lvlText w:val="%7."/>
+      <w:lvlJc w:val="left"/>
+      <w:pPr>
+        <w:ind w:left="5040" w:hanging="360"/>
+      </w:pPr>
+    </w:lvl>
+    <w:lvl xmlns:w="http://schemas.openxmlformats.org/wordprocessingml/2006/main" w:ilvl="7">
+      <w:start w:val="1"/>
+      <w:numFmt w:val="lowerLetter"/>
+      <w:lvlText w:val="%8."/>
+      <w:lvlJc w:val="left"/>
+      <w:pPr>
+        <w:ind w:left="5760" w:hanging="360"/>
+      </w:pPr>
+    </w:lvl>
+    <w:lvl xmlns:w="http://schemas.openxmlformats.org/wordprocessingml/2006/main" w:ilvl="8">
+      <w:start w:val="1"/>
+      <w:numFmt w:val="lowerRoman"/>
+      <w:lvlText w:val="%9."/>
+      <w:lvlJc w:val="right"/>
+      <w:pPr>
+        <w:ind w:left="6480" w:hanging="180"/>
+      </w:pPr>
+    </w:lvl>
+  </w:abstractNum>
+  <w:abstractNum xmlns:w="http://schemas.openxmlformats.org/wordprocessingml/2006/main" w:abstractNumId="2">
+    <w:nsid w:val="541fa7fb"/>
+    <w:multiLevelType xmlns:w="http://schemas.openxmlformats.org/wordprocessingml/2006/main" w:val="hybridMultilevel"/>
+    <w:lvl xmlns:w="http://schemas.openxmlformats.org/wordprocessingml/2006/main" w:ilvl="0">
+      <w:start w:val="1"/>
+      <w:numFmt w:val="decimal"/>
+      <w:lvlText w:val="%1."/>
+      <w:lvlJc w:val="left"/>
+      <w:pPr>
+        <w:ind w:left="720" w:hanging="360"/>
+      </w:pPr>
+    </w:lvl>
+    <w:lvl xmlns:w="http://schemas.openxmlformats.org/wordprocessingml/2006/main" w:ilvl="1">
+      <w:start w:val="1"/>
+      <w:numFmt w:val="lowerLetter"/>
+      <w:lvlText w:val="%2."/>
+      <w:lvlJc w:val="left"/>
+      <w:pPr>
+        <w:ind w:left="1440" w:hanging="360"/>
+      </w:pPr>
+    </w:lvl>
+    <w:lvl xmlns:w="http://schemas.openxmlformats.org/wordprocessingml/2006/main" w:ilvl="2">
+      <w:start w:val="1"/>
+      <w:numFmt w:val="lowerRoman"/>
+      <w:lvlText w:val="%3."/>
+      <w:lvlJc w:val="right"/>
+      <w:pPr>
+        <w:ind w:left="2160" w:hanging="180"/>
+      </w:pPr>
+    </w:lvl>
+    <w:lvl xmlns:w="http://schemas.openxmlformats.org/wordprocessingml/2006/main" w:ilvl="3">
+      <w:start w:val="1"/>
+      <w:numFmt w:val="decimal"/>
+      <w:lvlText w:val="%4."/>
+      <w:lvlJc w:val="left"/>
+      <w:pPr>
+        <w:ind w:left="2880" w:hanging="360"/>
+      </w:pPr>
+    </w:lvl>
+    <w:lvl xmlns:w="http://schemas.openxmlformats.org/wordprocessingml/2006/main" w:ilvl="4">
+      <w:start w:val="1"/>
+      <w:numFmt w:val="lowerLetter"/>
+      <w:lvlText w:val="%5."/>
+      <w:lvlJc w:val="left"/>
+      <w:pPr>
+        <w:ind w:left="3600" w:hanging="360"/>
+      </w:pPr>
+    </w:lvl>
+    <w:lvl xmlns:w="http://schemas.openxmlformats.org/wordprocessingml/2006/main" w:ilvl="5">
+      <w:start w:val="1"/>
+      <w:numFmt w:val="lowerRoman"/>
+      <w:lvlText w:val="%6."/>
+      <w:lvlJc w:val="right"/>
+      <w:pPr>
+        <w:ind w:left="4320" w:hanging="180"/>
+      </w:pPr>
+    </w:lvl>
+    <w:lvl xmlns:w="http://schemas.openxmlformats.org/wordprocessingml/2006/main" w:ilvl="6">
+      <w:start w:val="1"/>
+      <w:numFmt w:val="decimal"/>
+      <w:lvlText w:val="%7."/>
+      <w:lvlJc w:val="left"/>
+      <w:pPr>
+        <w:ind w:left="5040" w:hanging="360"/>
+      </w:pPr>
+    </w:lvl>
+    <w:lvl xmlns:w="http://schemas.openxmlformats.org/wordprocessingml/2006/main" w:ilvl="7">
+      <w:start w:val="1"/>
+      <w:numFmt w:val="lowerLetter"/>
+      <w:lvlText w:val="%8."/>
+      <w:lvlJc w:val="left"/>
+      <w:pPr>
+        <w:ind w:left="5760" w:hanging="360"/>
+      </w:pPr>
+    </w:lvl>
+    <w:lvl xmlns:w="http://schemas.openxmlformats.org/wordprocessingml/2006/main" w:ilvl="8">
+      <w:start w:val="1"/>
+      <w:numFmt w:val="lowerRoman"/>
+      <w:lvlText w:val="%9."/>
+      <w:lvlJc w:val="right"/>
+      <w:pPr>
+        <w:ind w:left="6480" w:hanging="180"/>
+      </w:pPr>
+    </w:lvl>
+  </w:abstractNum>
   <w:abstractNum w:abstractNumId="0" w15:restartNumberingAfterBreak="0">
     <w:nsid w:val="0CFA77BA"/>
     <w:multiLevelType w:val="hybridMultilevel"/>
@@ -571,6 +892,12 @@
       </w:pPr>
     </w:lvl>
   </w:abstractNum>
+  <w:num w:numId="4">
+    <w:abstractNumId w:val="3"/>
+  </w:num>
+  <w:num w:numId="3">
+    <w:abstractNumId w:val="2"/>
+  </w:num>
   <w:num w:numId="1" w16cid:durableId="731005035">
     <w:abstractNumId w:val="0"/>
   </w:num>
@@ -585,7 +912,7 @@
   <w:docDefaults>
     <w:rPrDefault>
       <w:rPr>
-        <w:rFonts w:asciiTheme="minorHAnsi" w:eastAsiaTheme="minorHAnsi" w:hAnsiTheme="minorHAnsi" w:cstheme="minorBidi"/>
+        <w:rFonts w:asciiTheme="minorHAnsi" w:hAnsiTheme="minorHAnsi" w:eastAsiaTheme="minorHAnsi" w:cstheme="minorBidi"/>
         <w:kern w:val="2"/>
         <w:sz w:val="24"/>
         <w:szCs w:val="39"/>
@@ -602,14 +929,14 @@
   <w:latentStyles w:defLockedState="0" w:defUIPriority="99" w:defSemiHidden="0" w:defUnhideWhenUsed="0" w:defQFormat="0" w:count="376">
     <w:lsdException w:name="Normal" w:uiPriority="0" w:qFormat="1"/>
     <w:lsdException w:name="heading 1" w:uiPriority="9" w:qFormat="1"/>
-    <w:lsdException w:name="heading 2" w:semiHidden="1" w:uiPriority="9" w:unhideWhenUsed="1" w:qFormat="1"/>
-    <w:lsdException w:name="heading 3" w:semiHidden="1" w:uiPriority="9" w:unhideWhenUsed="1" w:qFormat="1"/>
-    <w:lsdException w:name="heading 4" w:semiHidden="1" w:uiPriority="9" w:unhideWhenUsed="1" w:qFormat="1"/>
-    <w:lsdException w:name="heading 5" w:semiHidden="1" w:uiPriority="9" w:unhideWhenUsed="1" w:qFormat="1"/>
-    <w:lsdException w:name="heading 6" w:semiHidden="1" w:uiPriority="9" w:unhideWhenUsed="1" w:qFormat="1"/>
-    <w:lsdException w:name="heading 7" w:semiHidden="1" w:uiPriority="9" w:unhideWhenUsed="1" w:qFormat="1"/>
-    <w:lsdException w:name="heading 8" w:semiHidden="1" w:uiPriority="9" w:unhideWhenUsed="1" w:qFormat="1"/>
-    <w:lsdException w:name="heading 9" w:semiHidden="1" w:uiPriority="9" w:unhideWhenUsed="1" w:qFormat="1"/>
+    <w:lsdException w:name="heading 2" w:uiPriority="9" w:semiHidden="1" w:unhideWhenUsed="1" w:qFormat="1"/>
+    <w:lsdException w:name="heading 3" w:uiPriority="9" w:semiHidden="1" w:unhideWhenUsed="1" w:qFormat="1"/>
+    <w:lsdException w:name="heading 4" w:uiPriority="9" w:semiHidden="1" w:unhideWhenUsed="1" w:qFormat="1"/>
+    <w:lsdException w:name="heading 5" w:uiPriority="9" w:semiHidden="1" w:unhideWhenUsed="1" w:qFormat="1"/>
+    <w:lsdException w:name="heading 6" w:uiPriority="9" w:semiHidden="1" w:unhideWhenUsed="1" w:qFormat="1"/>
+    <w:lsdException w:name="heading 7" w:uiPriority="9" w:semiHidden="1" w:unhideWhenUsed="1" w:qFormat="1"/>
+    <w:lsdException w:name="heading 8" w:uiPriority="9" w:semiHidden="1" w:unhideWhenUsed="1" w:qFormat="1"/>
+    <w:lsdException w:name="heading 9" w:uiPriority="9" w:semiHidden="1" w:unhideWhenUsed="1" w:qFormat="1"/>
     <w:lsdException w:name="index 1" w:semiHidden="1" w:unhideWhenUsed="1"/>
     <w:lsdException w:name="index 2" w:semiHidden="1" w:unhideWhenUsed="1"/>
     <w:lsdException w:name="index 3" w:semiHidden="1" w:unhideWhenUsed="1"/>
@@ -619,22 +946,22 @@
     <w:lsdException w:name="index 7" w:semiHidden="1" w:unhideWhenUsed="1"/>
     <w:lsdException w:name="index 8" w:semiHidden="1" w:unhideWhenUsed="1"/>
     <w:lsdException w:name="index 9" w:semiHidden="1" w:unhideWhenUsed="1"/>
-    <w:lsdException w:name="toc 1" w:semiHidden="1" w:uiPriority="39" w:unhideWhenUsed="1"/>
-    <w:lsdException w:name="toc 2" w:semiHidden="1" w:uiPriority="39" w:unhideWhenUsed="1"/>
-    <w:lsdException w:name="toc 3" w:semiHidden="1" w:uiPriority="39" w:unhideWhenUsed="1"/>
-    <w:lsdException w:name="toc 4" w:semiHidden="1" w:uiPriority="39" w:unhideWhenUsed="1"/>
-    <w:lsdException w:name="toc 5" w:semiHidden="1" w:uiPriority="39" w:unhideWhenUsed="1"/>
-    <w:lsdException w:name="toc 6" w:semiHidden="1" w:uiPriority="39" w:unhideWhenUsed="1"/>
-    <w:lsdException w:name="toc 7" w:semiHidden="1" w:uiPriority="39" w:unhideWhenUsed="1"/>
-    <w:lsdException w:name="toc 8" w:semiHidden="1" w:uiPriority="39" w:unhideWhenUsed="1"/>
-    <w:lsdException w:name="toc 9" w:semiHidden="1" w:uiPriority="39" w:unhideWhenUsed="1"/>
+    <w:lsdException w:name="toc 1" w:uiPriority="39" w:semiHidden="1" w:unhideWhenUsed="1"/>
+    <w:lsdException w:name="toc 2" w:uiPriority="39" w:semiHidden="1" w:unhideWhenUsed="1"/>
+    <w:lsdException w:name="toc 3" w:uiPriority="39" w:semiHidden="1" w:unhideWhenUsed="1"/>
+    <w:lsdException w:name="toc 4" w:uiPriority="39" w:semiHidden="1" w:unhideWhenUsed="1"/>
+    <w:lsdException w:name="toc 5" w:uiPriority="39" w:semiHidden="1" w:unhideWhenUsed="1"/>
+    <w:lsdException w:name="toc 6" w:uiPriority="39" w:semiHidden="1" w:unhideWhenUsed="1"/>
+    <w:lsdException w:name="toc 7" w:uiPriority="39" w:semiHidden="1" w:unhideWhenUsed="1"/>
+    <w:lsdException w:name="toc 8" w:uiPriority="39" w:semiHidden="1" w:unhideWhenUsed="1"/>
+    <w:lsdException w:name="toc 9" w:uiPriority="39" w:semiHidden="1" w:unhideWhenUsed="1"/>
     <w:lsdException w:name="Normal Indent" w:semiHidden="1" w:unhideWhenUsed="1"/>
     <w:lsdException w:name="footnote text" w:semiHidden="1" w:unhideWhenUsed="1"/>
     <w:lsdException w:name="annotation text" w:semiHidden="1" w:unhideWhenUsed="1"/>
     <w:lsdException w:name="header" w:semiHidden="1" w:unhideWhenUsed="1"/>
     <w:lsdException w:name="footer" w:semiHidden="1" w:unhideWhenUsed="1"/>
     <w:lsdException w:name="index heading" w:semiHidden="1" w:unhideWhenUsed="1"/>
-    <w:lsdException w:name="caption" w:semiHidden="1" w:uiPriority="35" w:unhideWhenUsed="1" w:qFormat="1"/>
+    <w:lsdException w:name="caption" w:uiPriority="35" w:semiHidden="1" w:unhideWhenUsed="1" w:qFormat="1"/>
     <w:lsdException w:name="table of figures" w:semiHidden="1" w:unhideWhenUsed="1"/>
     <w:lsdException w:name="envelope address" w:semiHidden="1" w:unhideWhenUsed="1"/>
     <w:lsdException w:name="envelope return" w:semiHidden="1" w:unhideWhenUsed="1"/>
@@ -665,7 +992,7 @@
     <w:lsdException w:name="Title" w:uiPriority="10" w:qFormat="1"/>
     <w:lsdException w:name="Closing" w:semiHidden="1" w:unhideWhenUsed="1"/>
     <w:lsdException w:name="Signature" w:semiHidden="1" w:unhideWhenUsed="1"/>
-    <w:lsdException w:name="Default Paragraph Font" w:semiHidden="1" w:uiPriority="1" w:unhideWhenUsed="1"/>
+    <w:lsdException w:name="Default Paragraph Font" w:uiPriority="1" w:semiHidden="1" w:unhideWhenUsed="1"/>
     <w:lsdException w:name="Body Text" w:semiHidden="1" w:unhideWhenUsed="1"/>
     <w:lsdException w:name="Body Text Indent" w:semiHidden="1" w:unhideWhenUsed="1"/>
     <w:lsdException w:name="List Continue" w:semiHidden="1" w:unhideWhenUsed="1"/>
@@ -865,8 +1192,8 @@
     <w:lsdException w:name="Subtle Reference" w:uiPriority="31" w:qFormat="1"/>
     <w:lsdException w:name="Intense Reference" w:uiPriority="32" w:qFormat="1"/>
     <w:lsdException w:name="Book Title" w:uiPriority="33" w:qFormat="1"/>
-    <w:lsdException w:name="Bibliography" w:semiHidden="1" w:uiPriority="37" w:unhideWhenUsed="1"/>
-    <w:lsdException w:name="TOC Heading" w:semiHidden="1" w:uiPriority="39" w:unhideWhenUsed="1" w:qFormat="1"/>
+    <w:lsdException w:name="Bibliography" w:uiPriority="37" w:semiHidden="1" w:unhideWhenUsed="1"/>
+    <w:lsdException w:name="TOC Heading" w:uiPriority="39" w:semiHidden="1" w:unhideWhenUsed="1" w:qFormat="1"/>
     <w:lsdException w:name="Plain Table 1" w:uiPriority="41"/>
     <w:lsdException w:name="Plain Table 2" w:uiPriority="42"/>
     <w:lsdException w:name="Plain Table 3" w:uiPriority="43"/>
@@ -977,7 +1304,7 @@
     <w:lsdException w:name="Unresolved Mention" w:semiHidden="1" w:unhideWhenUsed="1"/>
     <w:lsdException w:name="Smart Link" w:semiHidden="1" w:unhideWhenUsed="1"/>
   </w:latentStyles>
-  <w:style w:type="paragraph" w:default="1" w:styleId="Normal">
+  <w:style w:type="paragraph" w:styleId="Normal" w:default="1">
     <w:name w:val="Normal"/>
     <w:qFormat/>
     <w:rPr>
@@ -999,7 +1326,7 @@
       <w:outlineLvl w:val="0"/>
     </w:pPr>
     <w:rPr>
-      <w:rFonts w:asciiTheme="majorHAnsi" w:eastAsiaTheme="majorEastAsia" w:hAnsiTheme="majorHAnsi" w:cstheme="majorBidi"/>
+      <w:rFonts w:asciiTheme="majorHAnsi" w:hAnsiTheme="majorHAnsi" w:eastAsiaTheme="majorEastAsia" w:cstheme="majorBidi"/>
       <w:color w:val="0F4761" w:themeColor="accent1" w:themeShade="BF"/>
       <w:sz w:val="40"/>
       <w:szCs w:val="65"/>
@@ -1022,7 +1349,7 @@
       <w:outlineLvl w:val="1"/>
     </w:pPr>
     <w:rPr>
-      <w:rFonts w:asciiTheme="majorHAnsi" w:eastAsiaTheme="majorEastAsia" w:hAnsiTheme="majorHAnsi" w:cstheme="majorBidi"/>
+      <w:rFonts w:asciiTheme="majorHAnsi" w:hAnsiTheme="majorHAnsi" w:eastAsiaTheme="majorEastAsia" w:cstheme="majorBidi"/>
       <w:color w:val="0F4761" w:themeColor="accent1" w:themeShade="BF"/>
       <w:sz w:val="32"/>
       <w:szCs w:val="52"/>
@@ -1183,13 +1510,13 @@
       <w:color w:val="272727" w:themeColor="text1" w:themeTint="D8"/>
     </w:rPr>
   </w:style>
-  <w:style w:type="character" w:default="1" w:styleId="DefaultParagraphFont">
+  <w:style w:type="character" w:styleId="DefaultParagraphFont" w:default="1">
     <w:name w:val="Default Paragraph Font"/>
     <w:uiPriority w:val="1"/>
     <w:semiHidden/>
     <w:unhideWhenUsed/>
   </w:style>
-  <w:style w:type="table" w:default="1" w:styleId="TableNormal">
+  <w:style w:type="table" w:styleId="TableNormal" w:default="1">
     <w:name w:val="Normal Table"/>
     <w:uiPriority w:val="99"/>
     <w:semiHidden/>
@@ -1204,26 +1531,26 @@
       </w:tblCellMar>
     </w:tblPr>
   </w:style>
-  <w:style w:type="numbering" w:default="1" w:styleId="NoList">
+  <w:style w:type="numbering" w:styleId="NoList" w:default="1">
     <w:name w:val="No List"/>
     <w:uiPriority w:val="99"/>
     <w:semiHidden/>
     <w:unhideWhenUsed/>
   </w:style>
-  <w:style w:type="character" w:customStyle="1" w:styleId="Heading1Char">
+  <w:style w:type="character" w:styleId="Heading1Char" w:customStyle="1">
     <w:name w:val="Heading 1 Char"/>
     <w:basedOn w:val="DefaultParagraphFont"/>
     <w:link w:val="Heading1"/>
     <w:uiPriority w:val="9"/>
     <w:rsid w:val="00D077A6"/>
     <w:rPr>
-      <w:rFonts w:asciiTheme="majorHAnsi" w:eastAsiaTheme="majorEastAsia" w:hAnsiTheme="majorHAnsi" w:cstheme="majorBidi"/>
+      <w:rFonts w:asciiTheme="majorHAnsi" w:hAnsiTheme="majorHAnsi" w:eastAsiaTheme="majorEastAsia" w:cstheme="majorBidi"/>
       <w:color w:val="0F4761" w:themeColor="accent1" w:themeShade="BF"/>
       <w:sz w:val="40"/>
       <w:szCs w:val="65"/>
     </w:rPr>
   </w:style>
-  <w:style w:type="character" w:customStyle="1" w:styleId="Heading2Char">
+  <w:style w:type="character" w:styleId="Heading2Char" w:customStyle="1">
     <w:name w:val="Heading 2 Char"/>
     <w:basedOn w:val="DefaultParagraphFont"/>
     <w:link w:val="Heading2"/>
@@ -1231,13 +1558,13 @@
     <w:semiHidden/>
     <w:rsid w:val="00D077A6"/>
     <w:rPr>
-      <w:rFonts w:asciiTheme="majorHAnsi" w:eastAsiaTheme="majorEastAsia" w:hAnsiTheme="majorHAnsi" w:cstheme="majorBidi"/>
+      <w:rFonts w:asciiTheme="majorHAnsi" w:hAnsiTheme="majorHAnsi" w:eastAsiaTheme="majorEastAsia" w:cstheme="majorBidi"/>
       <w:color w:val="0F4761" w:themeColor="accent1" w:themeShade="BF"/>
       <w:sz w:val="32"/>
       <w:szCs w:val="52"/>
     </w:rPr>
   </w:style>
-  <w:style w:type="character" w:customStyle="1" w:styleId="Heading3Char">
+  <w:style w:type="character" w:styleId="Heading3Char" w:customStyle="1">
     <w:name w:val="Heading 3 Char"/>
     <w:basedOn w:val="DefaultParagraphFont"/>
     <w:link w:val="Heading3"/>
@@ -1251,7 +1578,7 @@
       <w:szCs w:val="45"/>
     </w:rPr>
   </w:style>
-  <w:style w:type="character" w:customStyle="1" w:styleId="Heading4Char">
+  <w:style w:type="character" w:styleId="Heading4Char" w:customStyle="1">
     <w:name w:val="Heading 4 Char"/>
     <w:basedOn w:val="DefaultParagraphFont"/>
     <w:link w:val="Heading4"/>
@@ -1265,7 +1592,7 @@
       <w:color w:val="0F4761" w:themeColor="accent1" w:themeShade="BF"/>
     </w:rPr>
   </w:style>
-  <w:style w:type="character" w:customStyle="1" w:styleId="Heading5Char">
+  <w:style w:type="character" w:styleId="Heading5Char" w:customStyle="1">
     <w:name w:val="Heading 5 Char"/>
     <w:basedOn w:val="DefaultParagraphFont"/>
     <w:link w:val="Heading5"/>
@@ -1277,7 +1604,7 @@
       <w:color w:val="0F4761" w:themeColor="accent1" w:themeShade="BF"/>
     </w:rPr>
   </w:style>
-  <w:style w:type="character" w:customStyle="1" w:styleId="Heading6Char">
+  <w:style w:type="character" w:styleId="Heading6Char" w:customStyle="1">
     <w:name w:val="Heading 6 Char"/>
     <w:basedOn w:val="DefaultParagraphFont"/>
     <w:link w:val="Heading6"/>
@@ -1291,7 +1618,7 @@
       <w:color w:val="595959" w:themeColor="text1" w:themeTint="A6"/>
     </w:rPr>
   </w:style>
-  <w:style w:type="character" w:customStyle="1" w:styleId="Heading7Char">
+  <w:style w:type="character" w:styleId="Heading7Char" w:customStyle="1">
     <w:name w:val="Heading 7 Char"/>
     <w:basedOn w:val="DefaultParagraphFont"/>
     <w:link w:val="Heading7"/>
@@ -1303,7 +1630,7 @@
       <w:color w:val="595959" w:themeColor="text1" w:themeTint="A6"/>
     </w:rPr>
   </w:style>
-  <w:style w:type="character" w:customStyle="1" w:styleId="Heading8Char">
+  <w:style w:type="character" w:styleId="Heading8Char" w:customStyle="1">
     <w:name w:val="Heading 8 Char"/>
     <w:basedOn w:val="DefaultParagraphFont"/>
     <w:link w:val="Heading8"/>
@@ -1317,7 +1644,7 @@
       <w:color w:val="272727" w:themeColor="text1" w:themeTint="D8"/>
     </w:rPr>
   </w:style>
-  <w:style w:type="character" w:customStyle="1" w:styleId="Heading9Char">
+  <w:style w:type="character" w:styleId="Heading9Char" w:customStyle="1">
     <w:name w:val="Heading 9 Char"/>
     <w:basedOn w:val="DefaultParagraphFont"/>
     <w:link w:val="Heading9"/>
@@ -1342,21 +1669,21 @@
       <w:contextualSpacing/>
     </w:pPr>
     <w:rPr>
-      <w:rFonts w:asciiTheme="majorHAnsi" w:eastAsiaTheme="majorEastAsia" w:hAnsiTheme="majorHAnsi" w:cstheme="majorBidi"/>
+      <w:rFonts w:asciiTheme="majorHAnsi" w:hAnsiTheme="majorHAnsi" w:eastAsiaTheme="majorEastAsia" w:cstheme="majorBidi"/>
       <w:spacing w:val="-10"/>
       <w:kern w:val="28"/>
       <w:sz w:val="56"/>
       <w:szCs w:val="91"/>
     </w:rPr>
   </w:style>
-  <w:style w:type="character" w:customStyle="1" w:styleId="TitleChar">
+  <w:style w:type="character" w:styleId="TitleChar" w:customStyle="1">
     <w:name w:val="Title Char"/>
     <w:basedOn w:val="DefaultParagraphFont"/>
     <w:link w:val="Title"/>
     <w:uiPriority w:val="10"/>
     <w:rsid w:val="00D077A6"/>
     <w:rPr>
-      <w:rFonts w:asciiTheme="majorHAnsi" w:eastAsiaTheme="majorEastAsia" w:hAnsiTheme="majorHAnsi" w:cstheme="majorBidi"/>
+      <w:rFonts w:asciiTheme="majorHAnsi" w:hAnsiTheme="majorHAnsi" w:eastAsiaTheme="majorEastAsia" w:cstheme="majorBidi"/>
       <w:spacing w:val="-10"/>
       <w:kern w:val="28"/>
       <w:sz w:val="56"/>
@@ -1384,7 +1711,7 @@
       <w:szCs w:val="45"/>
     </w:rPr>
   </w:style>
-  <w:style w:type="character" w:customStyle="1" w:styleId="SubtitleChar">
+  <w:style w:type="character" w:styleId="SubtitleChar" w:customStyle="1">
     <w:name w:val="Subtitle Char"/>
     <w:basedOn w:val="DefaultParagraphFont"/>
     <w:link w:val="Subtitle"/>
@@ -1416,7 +1743,7 @@
       <w:color w:val="404040" w:themeColor="text1" w:themeTint="BF"/>
     </w:rPr>
   </w:style>
-  <w:style w:type="character" w:customStyle="1" w:styleId="QuoteChar">
+  <w:style w:type="character" w:styleId="QuoteChar" w:customStyle="1">
     <w:name w:val="Quote Char"/>
     <w:basedOn w:val="DefaultParagraphFont"/>
     <w:link w:val="Quote"/>
@@ -1462,8 +1789,8 @@
     <w:rsid w:val="00D077A6"/>
     <w:pPr>
       <w:pBdr>
-        <w:top w:val="single" w:sz="4" w:space="10" w:color="0F4761" w:themeColor="accent1" w:themeShade="BF"/>
-        <w:bottom w:val="single" w:sz="4" w:space="10" w:color="0F4761" w:themeColor="accent1" w:themeShade="BF"/>
+        <w:top w:val="single" w:color="0F4761" w:themeColor="accent1" w:themeShade="BF" w:sz="4" w:space="10"/>
+        <w:bottom w:val="single" w:color="0F4761" w:themeColor="accent1" w:themeShade="BF" w:sz="4" w:space="10"/>
       </w:pBdr>
       <w:spacing w:before="360" w:after="360"/>
       <w:ind w:left="864" w:right="864"/>
@@ -1475,7 +1802,7 @@
       <w:color w:val="0F4761" w:themeColor="accent1" w:themeShade="BF"/>
     </w:rPr>
   </w:style>
-  <w:style w:type="character" w:customStyle="1" w:styleId="IntenseQuoteChar">
+  <w:style w:type="character" w:styleId="IntenseQuoteChar" w:customStyle="1">
     <w:name w:val="Intense Quote Char"/>
     <w:basedOn w:val="DefaultParagraphFont"/>
     <w:link w:val="IntenseQuote"/>
@@ -1517,7 +1844,7 @@
 </file>
 
 <file path=word/theme/theme1.xml><?xml version="1.0" encoding="utf-8"?>
-<a:theme xmlns:a="http://schemas.openxmlformats.org/drawingml/2006/main" name="Office Theme">
+<a:theme xmlns:a="http://schemas.openxmlformats.org/drawingml/2006/main" xmlns:thm15="http://schemas.microsoft.com/office/thememl/2012/main" name="Office Theme">
   <a:themeElements>
     <a:clrScheme name="Office">
       <a:dk1>

</xml_diff>

<commit_message>
Deleted unused files and did line spacing edits on some files
</commit_message>
<xml_diff>
--- a/Documentation/Sprint 1 Deliverables/userStories.docx
+++ b/Documentation/Sprint 1 Deliverables/userStories.docx
@@ -1,11 +1,11 @@
 
 <file path=word/document.xml><?xml version="1.0" encoding="utf-8"?>
-<w:document xmlns:wpc="http://schemas.microsoft.com/office/word/2010/wordprocessingCanvas" xmlns:cx="http://schemas.microsoft.com/office/drawing/2014/chartex" xmlns:cx1="http://schemas.microsoft.com/office/drawing/2015/9/8/chartex" xmlns:cx2="http://schemas.microsoft.com/office/drawing/2015/10/21/chartex" xmlns:cx3="http://schemas.microsoft.com/office/drawing/2016/5/9/chartex" xmlns:cx4="http://schemas.microsoft.com/office/drawing/2016/5/10/chartex" xmlns:cx5="http://schemas.microsoft.com/office/drawing/2016/5/11/chartex" xmlns:cx6="http://schemas.microsoft.com/office/drawing/2016/5/12/chartex" xmlns:cx7="http://schemas.microsoft.com/office/drawing/2016/5/13/chartex" xmlns:cx8="http://schemas.microsoft.com/office/drawing/2016/5/14/chartex" xmlns:mc="http://schemas.openxmlformats.org/markup-compatibility/2006" xmlns:m="http://schemas.openxmlformats.org/officeDocument/2006/math" xmlns:aink="http://schemas.microsoft.com/office/drawing/2016/ink" xmlns:am3d="http://schemas.microsoft.com/office/drawing/2017/model3d" xmlns:oel="http://schemas.microsoft.com/office/2019/extlst" xmlns:r="http://schemas.openxmlformats.org/officeDocument/2006/relationships" xmlns:wp14="http://schemas.microsoft.com/office/word/2010/wordprocessingDrawing" xmlns:wp="http://schemas.openxmlformats.org/drawingml/2006/wordprocessingDrawing" xmlns:wpg="http://schemas.microsoft.com/office/word/2010/wordprocessingGroup" xmlns:wpi="http://schemas.microsoft.com/office/word/2010/wordprocessingInk" xmlns:wps="http://schemas.microsoft.com/office/word/2010/wordprocessingShape" xmlns:o="urn:schemas-microsoft-com:office:office" xmlns:v="urn:schemas-microsoft-com:vml" xmlns:w10="urn:schemas-microsoft-com:office:word" xmlns:w="http://schemas.openxmlformats.org/wordprocessingml/2006/main" xmlns:w14="http://schemas.microsoft.com/office/word/2010/wordml" xmlns:w15="http://schemas.microsoft.com/office/word/2012/wordml" xmlns:w16cex="http://schemas.microsoft.com/office/word/2018/wordml/cex" xmlns:w16cid="http://schemas.microsoft.com/office/word/2016/wordml/cid" xmlns:w16="http://schemas.microsoft.com/office/word/2018/wordml" xmlns:w16sdtdh="http://schemas.microsoft.com/office/word/2020/wordml/sdtdatahash" xmlns:w16sdtfl="http://schemas.microsoft.com/office/word/2024/wordml/sdtformatlock" xmlns:w16se="http://schemas.microsoft.com/office/word/2015/wordml/symex" xmlns:w16du="http://schemas.microsoft.com/office/word/2023/wordml/word16du" xmlns:wne="http://schemas.microsoft.com/office/word/2006/wordml" mc:Ignorable="w14 w15 w16se w16cid w16 w16cex w16sdtdh w16sdtfl w16du wp14">
+<w:document xmlns:wpc="http://schemas.microsoft.com/office/word/2010/wordprocessingCanvas" xmlns:cx="http://schemas.microsoft.com/office/drawing/2014/chartex" xmlns:cx1="http://schemas.microsoft.com/office/drawing/2015/9/8/chartex" xmlns:cx2="http://schemas.microsoft.com/office/drawing/2015/10/21/chartex" xmlns:cx3="http://schemas.microsoft.com/office/drawing/2016/5/9/chartex" xmlns:cx4="http://schemas.microsoft.com/office/drawing/2016/5/10/chartex" xmlns:cx5="http://schemas.microsoft.com/office/drawing/2016/5/11/chartex" xmlns:cx6="http://schemas.microsoft.com/office/drawing/2016/5/12/chartex" xmlns:cx7="http://schemas.microsoft.com/office/drawing/2016/5/13/chartex" xmlns:cx8="http://schemas.microsoft.com/office/drawing/2016/5/14/chartex" xmlns:mc="http://schemas.openxmlformats.org/markup-compatibility/2006" xmlns:aink="http://schemas.microsoft.com/office/drawing/2016/ink" xmlns:am3d="http://schemas.microsoft.com/office/drawing/2017/model3d" xmlns:o="urn:schemas-microsoft-com:office:office" xmlns:oel="http://schemas.microsoft.com/office/2019/extlst" xmlns:r="http://schemas.openxmlformats.org/officeDocument/2006/relationships" xmlns:m="http://schemas.openxmlformats.org/officeDocument/2006/math" xmlns:v="urn:schemas-microsoft-com:vml" xmlns:wp14="http://schemas.microsoft.com/office/word/2010/wordprocessingDrawing" xmlns:wp="http://schemas.openxmlformats.org/drawingml/2006/wordprocessingDrawing" xmlns:w10="urn:schemas-microsoft-com:office:word" xmlns:w="http://schemas.openxmlformats.org/wordprocessingml/2006/main" xmlns:w14="http://schemas.microsoft.com/office/word/2010/wordml" xmlns:w15="http://schemas.microsoft.com/office/word/2012/wordml" xmlns:w16cei="http://schemas.microsoft.com/office/word/2026/wordml/cei" xmlns:w16cex="http://schemas.microsoft.com/office/word/2018/wordml/cex" xmlns:w16cid="http://schemas.microsoft.com/office/word/2016/wordml/cid" xmlns:w16="http://schemas.microsoft.com/office/word/2018/wordml" xmlns:w16du="http://schemas.microsoft.com/office/word/2023/wordml/word16du" xmlns:w16sdtdh="http://schemas.microsoft.com/office/word/2020/wordml/sdtdatahash" xmlns:w16sdtfl="http://schemas.microsoft.com/office/word/2024/wordml/sdtformatlock" xmlns:w16se="http://schemas.microsoft.com/office/word/2015/wordml/symex" xmlns:wpg="http://schemas.microsoft.com/office/word/2010/wordprocessingGroup" xmlns:wpi="http://schemas.microsoft.com/office/word/2010/wordprocessingInk" xmlns:wne="http://schemas.microsoft.com/office/word/2006/wordml" xmlns:wps="http://schemas.microsoft.com/office/word/2010/wordprocessingShape" mc:Ignorable="w14 w15 w16se w16cid w16 w16cex w16sdtdh w16sdtfl w16du wp14">
   <w:body>
     <w:p>
       <w:pPr>
         <w:rPr>
-          <w:rFonts w:ascii="Times New Roman" w:hAnsi="Times New Roman" w:eastAsia="Times New Roman" w:cs="Times New Roman"/>
+          <w:rFonts w:ascii="Times New Roman" w:eastAsia="Times New Roman" w:hAnsi="Times New Roman" w:cs="Times New Roman"/>
           <w:sz w:val="36"/>
           <w:szCs w:val="36"/>
           <w:lang w:val="en-US"/>
@@ -13,7 +13,7 @@
       </w:pPr>
       <w:r>
         <w:rPr>
-          <w:rFonts w:ascii="Times New Roman" w:hAnsi="Times New Roman" w:eastAsia="Times New Roman" w:cs="Times New Roman"/>
+          <w:rFonts w:ascii="Times New Roman" w:eastAsia="Times New Roman" w:hAnsi="Times New Roman" w:cs="Times New Roman"/>
           <w:sz w:val="36"/>
           <w:szCs w:val="36"/>
           <w:lang w:val="en-US"/>
@@ -24,34 +24,25 @@
     <w:p>
       <w:pPr>
         <w:rPr>
-          <w:rFonts w:ascii="Times New Roman" w:hAnsi="Times New Roman" w:eastAsia="Times New Roman" w:cs="Times New Roman"/>
+          <w:rFonts w:ascii="Times New Roman" w:eastAsia="Times New Roman" w:hAnsi="Times New Roman" w:cs="Times New Roman"/>
           <w:lang w:val="en-US"/>
         </w:rPr>
       </w:pPr>
       <w:r>
         <w:rPr>
-          <w:rFonts w:ascii="Times New Roman" w:hAnsi="Times New Roman" w:eastAsia="Times New Roman" w:cs="Times New Roman"/>
-        </w:rPr>
-        <w:t>The following user stories define the functionality to be developed during Sprint 2</w:t>
-      </w:r>
-      <w:r>
-        <w:rPr>
-          <w:rFonts w:ascii="Times New Roman" w:hAnsi="Times New Roman" w:eastAsia="Times New Roman" w:cs="Times New Roman"/>
-        </w:rPr>
-        <w:t>.</w:t>
+          <w:rFonts w:ascii="Times New Roman" w:eastAsia="Times New Roman" w:hAnsi="Times New Roman" w:cs="Times New Roman"/>
+        </w:rPr>
+        <w:t>The following user stories define the functionality to be developed during Sprint 2.</w:t>
       </w:r>
     </w:p>
     <w:p>
       <w:pPr>
-        <w:pStyle w:val="Normal"/>
         <w:spacing w:after="0"/>
       </w:pPr>
       <w:r>
         <w:rPr>
-          <w:rFonts w:ascii="Times New Roman" w:hAnsi="Times New Roman" w:eastAsia="Times New Roman" w:cs="Times New Roman"/>
-          <w:noProof w:val="0"/>
-          <w:color w:val="000000" w:themeColor="text1" w:themeTint="FF" w:themeShade="FF"/>
-          <w:sz w:val="24"/>
+          <w:rFonts w:ascii="Times New Roman" w:eastAsia="Times New Roman" w:hAnsi="Times New Roman" w:cs="Times New Roman"/>
+          <w:color w:val="000000" w:themeColor="text1"/>
           <w:szCs w:val="24"/>
           <w:lang w:val="en-US"/>
         </w:rPr>
@@ -60,13 +51,10 @@
     </w:p>
     <w:p>
       <w:pPr>
-        <w:pStyle w:val="Normal"/>
         <w:spacing w:after="0"/>
         <w:rPr>
-          <w:rFonts w:ascii="Times New Roman" w:hAnsi="Times New Roman" w:eastAsia="Times New Roman" w:cs="Times New Roman"/>
-          <w:noProof w:val="0"/>
-          <w:color w:val="000000" w:themeColor="text1" w:themeTint="FF" w:themeShade="FF"/>
-          <w:sz w:val="24"/>
+          <w:rFonts w:ascii="Times New Roman" w:eastAsia="Times New Roman" w:hAnsi="Times New Roman" w:cs="Times New Roman"/>
+          <w:color w:val="000000" w:themeColor="text1"/>
           <w:szCs w:val="24"/>
           <w:lang w:val="en-US"/>
         </w:rPr>
@@ -77,24 +65,20 @@
         <w:pStyle w:val="ListParagraph"/>
         <w:numPr>
           <w:ilvl w:val="0"/>
-          <w:numId w:val="5"/>
+          <w:numId w:val="4"/>
         </w:numPr>
-        <w:spacing w:before="0" w:beforeAutospacing="off" w:after="0" w:afterAutospacing="off"/>
-        <w:rPr>
-          <w:rFonts w:ascii="Times New Roman" w:hAnsi="Times New Roman" w:eastAsia="Times New Roman" w:cs="Times New Roman"/>
-          <w:noProof w:val="0"/>
-          <w:color w:val="000000" w:themeColor="text1" w:themeTint="FF" w:themeShade="FF"/>
-          <w:sz w:val="24"/>
+        <w:spacing w:after="0"/>
+        <w:rPr>
+          <w:rFonts w:ascii="Times New Roman" w:eastAsia="Times New Roman" w:hAnsi="Times New Roman" w:cs="Times New Roman"/>
+          <w:color w:val="000000" w:themeColor="text1"/>
           <w:szCs w:val="24"/>
           <w:lang w:val="en-US"/>
         </w:rPr>
       </w:pPr>
       <w:r>
         <w:rPr>
-          <w:rFonts w:ascii="Times New Roman" w:hAnsi="Times New Roman" w:eastAsia="Times New Roman" w:cs="Times New Roman"/>
-          <w:noProof w:val="0"/>
-          <w:color w:val="000000" w:themeColor="text1" w:themeTint="FF" w:themeShade="FF"/>
-          <w:sz w:val="24"/>
+          <w:rFonts w:ascii="Times New Roman" w:eastAsia="Times New Roman" w:hAnsi="Times New Roman" w:cs="Times New Roman"/>
+          <w:color w:val="000000" w:themeColor="text1"/>
           <w:szCs w:val="24"/>
           <w:lang w:val="en-US"/>
         </w:rPr>
@@ -106,24 +90,20 @@
         <w:pStyle w:val="ListParagraph"/>
         <w:numPr>
           <w:ilvl w:val="0"/>
-          <w:numId w:val="5"/>
+          <w:numId w:val="4"/>
         </w:numPr>
-        <w:spacing w:before="0" w:beforeAutospacing="off" w:after="0" w:afterAutospacing="off"/>
-        <w:rPr>
-          <w:rFonts w:ascii="Times New Roman" w:hAnsi="Times New Roman" w:eastAsia="Times New Roman" w:cs="Times New Roman"/>
-          <w:noProof w:val="0"/>
-          <w:color w:val="000000" w:themeColor="text1" w:themeTint="FF" w:themeShade="FF"/>
-          <w:sz w:val="24"/>
+        <w:spacing w:after="0"/>
+        <w:rPr>
+          <w:rFonts w:ascii="Times New Roman" w:eastAsia="Times New Roman" w:hAnsi="Times New Roman" w:cs="Times New Roman"/>
+          <w:color w:val="000000" w:themeColor="text1"/>
           <w:szCs w:val="24"/>
           <w:lang w:val="en-US"/>
         </w:rPr>
       </w:pPr>
       <w:r>
         <w:rPr>
-          <w:rFonts w:ascii="Times New Roman" w:hAnsi="Times New Roman" w:eastAsia="Times New Roman" w:cs="Times New Roman"/>
-          <w:noProof w:val="0"/>
-          <w:color w:val="000000" w:themeColor="text1" w:themeTint="FF" w:themeShade="FF"/>
-          <w:sz w:val="24"/>
+          <w:rFonts w:ascii="Times New Roman" w:eastAsia="Times New Roman" w:hAnsi="Times New Roman" w:cs="Times New Roman"/>
+          <w:color w:val="000000" w:themeColor="text1"/>
           <w:szCs w:val="24"/>
           <w:lang w:val="en-US"/>
         </w:rPr>
@@ -135,24 +115,20 @@
         <w:pStyle w:val="ListParagraph"/>
         <w:numPr>
           <w:ilvl w:val="0"/>
-          <w:numId w:val="5"/>
+          <w:numId w:val="4"/>
         </w:numPr>
-        <w:spacing w:before="0" w:beforeAutospacing="off" w:after="0" w:afterAutospacing="off"/>
-        <w:rPr>
-          <w:rFonts w:ascii="Times New Roman" w:hAnsi="Times New Roman" w:eastAsia="Times New Roman" w:cs="Times New Roman"/>
-          <w:noProof w:val="0"/>
-          <w:color w:val="000000" w:themeColor="text1" w:themeTint="FF" w:themeShade="FF"/>
-          <w:sz w:val="24"/>
+        <w:spacing w:after="0"/>
+        <w:rPr>
+          <w:rFonts w:ascii="Times New Roman" w:eastAsia="Times New Roman" w:hAnsi="Times New Roman" w:cs="Times New Roman"/>
+          <w:color w:val="000000" w:themeColor="text1"/>
           <w:szCs w:val="24"/>
           <w:lang w:val="en-US"/>
         </w:rPr>
       </w:pPr>
       <w:r>
         <w:rPr>
-          <w:rFonts w:ascii="Times New Roman" w:hAnsi="Times New Roman" w:eastAsia="Times New Roman" w:cs="Times New Roman"/>
-          <w:noProof w:val="0"/>
-          <w:color w:val="000000" w:themeColor="text1" w:themeTint="FF" w:themeShade="FF"/>
-          <w:sz w:val="24"/>
+          <w:rFonts w:ascii="Times New Roman" w:eastAsia="Times New Roman" w:hAnsi="Times New Roman" w:cs="Times New Roman"/>
+          <w:color w:val="000000" w:themeColor="text1"/>
           <w:szCs w:val="24"/>
           <w:lang w:val="en-US"/>
         </w:rPr>
@@ -164,24 +140,20 @@
         <w:pStyle w:val="ListParagraph"/>
         <w:numPr>
           <w:ilvl w:val="0"/>
-          <w:numId w:val="5"/>
+          <w:numId w:val="4"/>
         </w:numPr>
-        <w:spacing w:before="0" w:beforeAutospacing="off" w:after="0" w:afterAutospacing="off"/>
-        <w:rPr>
-          <w:rFonts w:ascii="Times New Roman" w:hAnsi="Times New Roman" w:eastAsia="Times New Roman" w:cs="Times New Roman"/>
-          <w:noProof w:val="0"/>
-          <w:color w:val="000000" w:themeColor="text1" w:themeTint="FF" w:themeShade="FF"/>
-          <w:sz w:val="24"/>
+        <w:spacing w:after="0"/>
+        <w:rPr>
+          <w:rFonts w:ascii="Times New Roman" w:eastAsia="Times New Roman" w:hAnsi="Times New Roman" w:cs="Times New Roman"/>
+          <w:color w:val="000000" w:themeColor="text1"/>
           <w:szCs w:val="24"/>
           <w:lang w:val="en-US"/>
         </w:rPr>
       </w:pPr>
       <w:r>
         <w:rPr>
-          <w:rFonts w:ascii="Times New Roman" w:hAnsi="Times New Roman" w:eastAsia="Times New Roman" w:cs="Times New Roman"/>
-          <w:noProof w:val="0"/>
-          <w:color w:val="000000" w:themeColor="text1" w:themeTint="FF" w:themeShade="FF"/>
-          <w:sz w:val="24"/>
+          <w:rFonts w:ascii="Times New Roman" w:eastAsia="Times New Roman" w:hAnsi="Times New Roman" w:cs="Times New Roman"/>
+          <w:color w:val="000000" w:themeColor="text1"/>
           <w:szCs w:val="24"/>
           <w:lang w:val="en-US"/>
         </w:rPr>
@@ -193,24 +165,20 @@
         <w:pStyle w:val="ListParagraph"/>
         <w:numPr>
           <w:ilvl w:val="0"/>
-          <w:numId w:val="5"/>
+          <w:numId w:val="4"/>
         </w:numPr>
-        <w:spacing w:before="0" w:beforeAutospacing="off" w:after="0" w:afterAutospacing="off"/>
-        <w:rPr>
-          <w:rFonts w:ascii="Times New Roman" w:hAnsi="Times New Roman" w:eastAsia="Times New Roman" w:cs="Times New Roman"/>
-          <w:noProof w:val="0"/>
-          <w:color w:val="000000" w:themeColor="text1" w:themeTint="FF" w:themeShade="FF"/>
-          <w:sz w:val="24"/>
+        <w:spacing w:after="0"/>
+        <w:rPr>
+          <w:rFonts w:ascii="Times New Roman" w:eastAsia="Times New Roman" w:hAnsi="Times New Roman" w:cs="Times New Roman"/>
+          <w:color w:val="000000" w:themeColor="text1"/>
           <w:szCs w:val="24"/>
           <w:lang w:val="en-US"/>
         </w:rPr>
       </w:pPr>
       <w:r>
         <w:rPr>
-          <w:rFonts w:ascii="Times New Roman" w:hAnsi="Times New Roman" w:eastAsia="Times New Roman" w:cs="Times New Roman"/>
-          <w:noProof w:val="0"/>
-          <w:color w:val="000000" w:themeColor="text1" w:themeTint="FF" w:themeShade="FF"/>
-          <w:sz w:val="24"/>
+          <w:rFonts w:ascii="Times New Roman" w:eastAsia="Times New Roman" w:hAnsi="Times New Roman" w:cs="Times New Roman"/>
+          <w:color w:val="000000" w:themeColor="text1"/>
           <w:szCs w:val="24"/>
           <w:lang w:val="en-US"/>
         </w:rPr>
@@ -222,24 +190,20 @@
         <w:pStyle w:val="ListParagraph"/>
         <w:numPr>
           <w:ilvl w:val="0"/>
-          <w:numId w:val="5"/>
+          <w:numId w:val="4"/>
         </w:numPr>
-        <w:spacing w:before="0" w:beforeAutospacing="off" w:after="0" w:afterAutospacing="off"/>
-        <w:rPr>
-          <w:rFonts w:ascii="Times New Roman" w:hAnsi="Times New Roman" w:eastAsia="Times New Roman" w:cs="Times New Roman"/>
-          <w:noProof w:val="0"/>
-          <w:color w:val="000000" w:themeColor="text1" w:themeTint="FF" w:themeShade="FF"/>
-          <w:sz w:val="24"/>
+        <w:spacing w:after="0"/>
+        <w:rPr>
+          <w:rFonts w:ascii="Times New Roman" w:eastAsia="Times New Roman" w:hAnsi="Times New Roman" w:cs="Times New Roman"/>
+          <w:color w:val="000000" w:themeColor="text1"/>
           <w:szCs w:val="24"/>
           <w:lang w:val="en-US"/>
         </w:rPr>
       </w:pPr>
       <w:r>
         <w:rPr>
-          <w:rFonts w:ascii="Times New Roman" w:hAnsi="Times New Roman" w:eastAsia="Times New Roman" w:cs="Times New Roman"/>
-          <w:noProof w:val="0"/>
-          <w:color w:val="000000" w:themeColor="text1" w:themeTint="FF" w:themeShade="FF"/>
-          <w:sz w:val="24"/>
+          <w:rFonts w:ascii="Times New Roman" w:eastAsia="Times New Roman" w:hAnsi="Times New Roman" w:cs="Times New Roman"/>
+          <w:color w:val="000000" w:themeColor="text1"/>
           <w:szCs w:val="24"/>
           <w:lang w:val="en-US"/>
         </w:rPr>
@@ -248,14 +212,12 @@
     </w:p>
     <w:p>
       <w:pPr>
-        <w:spacing w:before="240" w:beforeAutospacing="off" w:after="240" w:afterAutospacing="off"/>
+        <w:spacing w:before="240" w:after="240"/>
       </w:pPr>
       <w:r>
         <w:rPr>
-          <w:rFonts w:ascii="Times New Roman" w:hAnsi="Times New Roman" w:eastAsia="Times New Roman" w:cs="Times New Roman"/>
-          <w:noProof w:val="0"/>
-          <w:color w:val="000000" w:themeColor="text1" w:themeTint="FF" w:themeShade="FF"/>
-          <w:sz w:val="24"/>
+          <w:rFonts w:ascii="Times New Roman" w:eastAsia="Times New Roman" w:hAnsi="Times New Roman" w:cs="Times New Roman"/>
+          <w:color w:val="000000" w:themeColor="text1"/>
           <w:szCs w:val="24"/>
           <w:lang w:val="en-US"/>
         </w:rPr>
@@ -267,24 +229,20 @@
         <w:pStyle w:val="ListParagraph"/>
         <w:numPr>
           <w:ilvl w:val="0"/>
-          <w:numId w:val="6"/>
+          <w:numId w:val="3"/>
         </w:numPr>
-        <w:spacing w:before="0" w:beforeAutospacing="off" w:after="0" w:afterAutospacing="off"/>
-        <w:rPr>
-          <w:rFonts w:ascii="Times New Roman" w:hAnsi="Times New Roman" w:eastAsia="Times New Roman" w:cs="Times New Roman"/>
-          <w:noProof w:val="0"/>
-          <w:color w:val="000000" w:themeColor="text1" w:themeTint="FF" w:themeShade="FF"/>
-          <w:sz w:val="24"/>
+        <w:spacing w:after="0"/>
+        <w:rPr>
+          <w:rFonts w:ascii="Times New Roman" w:eastAsia="Times New Roman" w:hAnsi="Times New Roman" w:cs="Times New Roman"/>
+          <w:color w:val="000000" w:themeColor="text1"/>
           <w:szCs w:val="24"/>
           <w:lang w:val="en-US"/>
         </w:rPr>
       </w:pPr>
       <w:r>
         <w:rPr>
-          <w:rFonts w:ascii="Times New Roman" w:hAnsi="Times New Roman" w:eastAsia="Times New Roman" w:cs="Times New Roman"/>
-          <w:noProof w:val="0"/>
-          <w:color w:val="000000" w:themeColor="text1" w:themeTint="FF" w:themeShade="FF"/>
-          <w:sz w:val="24"/>
+          <w:rFonts w:ascii="Times New Roman" w:eastAsia="Times New Roman" w:hAnsi="Times New Roman" w:cs="Times New Roman"/>
+          <w:color w:val="000000" w:themeColor="text1"/>
           <w:szCs w:val="24"/>
           <w:lang w:val="en-US"/>
         </w:rPr>
@@ -296,24 +254,20 @@
         <w:pStyle w:val="ListParagraph"/>
         <w:numPr>
           <w:ilvl w:val="0"/>
-          <w:numId w:val="6"/>
+          <w:numId w:val="3"/>
         </w:numPr>
-        <w:spacing w:before="0" w:beforeAutospacing="off" w:after="0" w:afterAutospacing="off"/>
-        <w:rPr>
-          <w:rFonts w:ascii="Times New Roman" w:hAnsi="Times New Roman" w:eastAsia="Times New Roman" w:cs="Times New Roman"/>
-          <w:noProof w:val="0"/>
-          <w:color w:val="000000" w:themeColor="text1" w:themeTint="FF" w:themeShade="FF"/>
-          <w:sz w:val="24"/>
+        <w:spacing w:after="0"/>
+        <w:rPr>
+          <w:rFonts w:ascii="Times New Roman" w:eastAsia="Times New Roman" w:hAnsi="Times New Roman" w:cs="Times New Roman"/>
+          <w:color w:val="000000" w:themeColor="text1"/>
           <w:szCs w:val="24"/>
           <w:lang w:val="en-US"/>
         </w:rPr>
       </w:pPr>
       <w:r>
         <w:rPr>
-          <w:rFonts w:ascii="Times New Roman" w:hAnsi="Times New Roman" w:eastAsia="Times New Roman" w:cs="Times New Roman"/>
-          <w:noProof w:val="0"/>
-          <w:color w:val="000000" w:themeColor="text1" w:themeTint="FF" w:themeShade="FF"/>
-          <w:sz w:val="24"/>
+          <w:rFonts w:ascii="Times New Roman" w:eastAsia="Times New Roman" w:hAnsi="Times New Roman" w:cs="Times New Roman"/>
+          <w:color w:val="000000" w:themeColor="text1"/>
           <w:szCs w:val="24"/>
           <w:lang w:val="en-US"/>
         </w:rPr>
@@ -325,24 +279,20 @@
         <w:pStyle w:val="ListParagraph"/>
         <w:numPr>
           <w:ilvl w:val="0"/>
-          <w:numId w:val="6"/>
+          <w:numId w:val="3"/>
         </w:numPr>
-        <w:spacing w:before="0" w:beforeAutospacing="off" w:after="0" w:afterAutospacing="off"/>
-        <w:rPr>
-          <w:rFonts w:ascii="Times New Roman" w:hAnsi="Times New Roman" w:eastAsia="Times New Roman" w:cs="Times New Roman"/>
-          <w:noProof w:val="0"/>
-          <w:color w:val="000000" w:themeColor="text1" w:themeTint="FF" w:themeShade="FF"/>
-          <w:sz w:val="24"/>
+        <w:spacing w:after="0"/>
+        <w:rPr>
+          <w:rFonts w:ascii="Times New Roman" w:eastAsia="Times New Roman" w:hAnsi="Times New Roman" w:cs="Times New Roman"/>
+          <w:color w:val="000000" w:themeColor="text1"/>
           <w:szCs w:val="24"/>
           <w:lang w:val="en-US"/>
         </w:rPr>
       </w:pPr>
       <w:r>
         <w:rPr>
-          <w:rFonts w:ascii="Times New Roman" w:hAnsi="Times New Roman" w:eastAsia="Times New Roman" w:cs="Times New Roman"/>
-          <w:noProof w:val="0"/>
-          <w:color w:val="000000" w:themeColor="text1" w:themeTint="FF" w:themeShade="FF"/>
-          <w:sz w:val="24"/>
+          <w:rFonts w:ascii="Times New Roman" w:eastAsia="Times New Roman" w:hAnsi="Times New Roman" w:cs="Times New Roman"/>
+          <w:color w:val="000000" w:themeColor="text1"/>
           <w:szCs w:val="24"/>
           <w:lang w:val="en-US"/>
         </w:rPr>
@@ -354,24 +304,20 @@
         <w:pStyle w:val="ListParagraph"/>
         <w:numPr>
           <w:ilvl w:val="0"/>
-          <w:numId w:val="6"/>
+          <w:numId w:val="3"/>
         </w:numPr>
-        <w:spacing w:before="0" w:beforeAutospacing="off" w:after="0" w:afterAutospacing="off"/>
-        <w:rPr>
-          <w:rFonts w:ascii="Times New Roman" w:hAnsi="Times New Roman" w:eastAsia="Times New Roman" w:cs="Times New Roman"/>
-          <w:noProof w:val="0"/>
-          <w:color w:val="000000" w:themeColor="text1" w:themeTint="FF" w:themeShade="FF"/>
-          <w:sz w:val="24"/>
+        <w:spacing w:after="0"/>
+        <w:rPr>
+          <w:rFonts w:ascii="Times New Roman" w:eastAsia="Times New Roman" w:hAnsi="Times New Roman" w:cs="Times New Roman"/>
+          <w:color w:val="000000" w:themeColor="text1"/>
           <w:szCs w:val="24"/>
           <w:lang w:val="en-US"/>
         </w:rPr>
       </w:pPr>
       <w:r>
         <w:rPr>
-          <w:rFonts w:ascii="Times New Roman" w:hAnsi="Times New Roman" w:eastAsia="Times New Roman" w:cs="Times New Roman"/>
-          <w:noProof w:val="0"/>
-          <w:color w:val="000000" w:themeColor="text1" w:themeTint="FF" w:themeShade="FF"/>
-          <w:sz w:val="24"/>
+          <w:rFonts w:ascii="Times New Roman" w:eastAsia="Times New Roman" w:hAnsi="Times New Roman" w:cs="Times New Roman"/>
+          <w:color w:val="000000" w:themeColor="text1"/>
           <w:szCs w:val="24"/>
           <w:lang w:val="en-US"/>
         </w:rPr>
@@ -380,14 +326,12 @@
     </w:p>
     <w:p>
       <w:pPr>
-        <w:spacing w:before="240" w:beforeAutospacing="off" w:after="240" w:afterAutospacing="off"/>
+        <w:spacing w:before="240" w:after="240"/>
       </w:pPr>
       <w:r>
         <w:rPr>
-          <w:rFonts w:ascii="Times New Roman" w:hAnsi="Times New Roman" w:eastAsia="Times New Roman" w:cs="Times New Roman"/>
-          <w:noProof w:val="0"/>
-          <w:color w:val="000000" w:themeColor="text1" w:themeTint="FF" w:themeShade="FF"/>
-          <w:sz w:val="24"/>
+          <w:rFonts w:ascii="Times New Roman" w:eastAsia="Times New Roman" w:hAnsi="Times New Roman" w:cs="Times New Roman"/>
+          <w:color w:val="000000" w:themeColor="text1"/>
           <w:szCs w:val="24"/>
           <w:lang w:val="en-US"/>
         </w:rPr>
@@ -399,24 +343,20 @@
         <w:pStyle w:val="ListParagraph"/>
         <w:numPr>
           <w:ilvl w:val="0"/>
-          <w:numId w:val="7"/>
+          <w:numId w:val="2"/>
         </w:numPr>
-        <w:spacing w:before="0" w:beforeAutospacing="off" w:after="0" w:afterAutospacing="off"/>
-        <w:rPr>
-          <w:rFonts w:ascii="Times New Roman" w:hAnsi="Times New Roman" w:eastAsia="Times New Roman" w:cs="Times New Roman"/>
-          <w:noProof w:val="0"/>
-          <w:color w:val="000000" w:themeColor="text1" w:themeTint="FF" w:themeShade="FF"/>
-          <w:sz w:val="24"/>
+        <w:spacing w:after="0"/>
+        <w:rPr>
+          <w:rFonts w:ascii="Times New Roman" w:eastAsia="Times New Roman" w:hAnsi="Times New Roman" w:cs="Times New Roman"/>
+          <w:color w:val="000000" w:themeColor="text1"/>
           <w:szCs w:val="24"/>
           <w:lang w:val="en-US"/>
         </w:rPr>
       </w:pPr>
       <w:r>
         <w:rPr>
-          <w:rFonts w:ascii="Times New Roman" w:hAnsi="Times New Roman" w:eastAsia="Times New Roman" w:cs="Times New Roman"/>
-          <w:noProof w:val="0"/>
-          <w:color w:val="000000" w:themeColor="text1" w:themeTint="FF" w:themeShade="FF"/>
-          <w:sz w:val="24"/>
+          <w:rFonts w:ascii="Times New Roman" w:eastAsia="Times New Roman" w:hAnsi="Times New Roman" w:cs="Times New Roman"/>
+          <w:color w:val="000000" w:themeColor="text1"/>
           <w:szCs w:val="24"/>
           <w:lang w:val="en-US"/>
         </w:rPr>
@@ -428,24 +368,20 @@
         <w:pStyle w:val="ListParagraph"/>
         <w:numPr>
           <w:ilvl w:val="0"/>
-          <w:numId w:val="7"/>
+          <w:numId w:val="2"/>
         </w:numPr>
-        <w:spacing w:before="0" w:beforeAutospacing="off" w:after="0" w:afterAutospacing="off"/>
-        <w:rPr>
-          <w:rFonts w:ascii="Times New Roman" w:hAnsi="Times New Roman" w:eastAsia="Times New Roman" w:cs="Times New Roman"/>
-          <w:noProof w:val="0"/>
-          <w:color w:val="000000" w:themeColor="text1" w:themeTint="FF" w:themeShade="FF"/>
-          <w:sz w:val="24"/>
+        <w:spacing w:after="0"/>
+        <w:rPr>
+          <w:rFonts w:ascii="Times New Roman" w:eastAsia="Times New Roman" w:hAnsi="Times New Roman" w:cs="Times New Roman"/>
+          <w:color w:val="000000" w:themeColor="text1"/>
           <w:szCs w:val="24"/>
           <w:lang w:val="en-US"/>
         </w:rPr>
       </w:pPr>
       <w:r>
         <w:rPr>
-          <w:rFonts w:ascii="Times New Roman" w:hAnsi="Times New Roman" w:eastAsia="Times New Roman" w:cs="Times New Roman"/>
-          <w:noProof w:val="0"/>
-          <w:color w:val="000000" w:themeColor="text1" w:themeTint="FF" w:themeShade="FF"/>
-          <w:sz w:val="24"/>
+          <w:rFonts w:ascii="Times New Roman" w:eastAsia="Times New Roman" w:hAnsi="Times New Roman" w:cs="Times New Roman"/>
+          <w:color w:val="000000" w:themeColor="text1"/>
           <w:szCs w:val="24"/>
           <w:lang w:val="en-US"/>
         </w:rPr>
@@ -457,24 +393,20 @@
         <w:pStyle w:val="ListParagraph"/>
         <w:numPr>
           <w:ilvl w:val="0"/>
-          <w:numId w:val="7"/>
+          <w:numId w:val="2"/>
         </w:numPr>
-        <w:spacing w:before="0" w:beforeAutospacing="off" w:after="0" w:afterAutospacing="off"/>
-        <w:rPr>
-          <w:rFonts w:ascii="Times New Roman" w:hAnsi="Times New Roman" w:eastAsia="Times New Roman" w:cs="Times New Roman"/>
-          <w:noProof w:val="0"/>
-          <w:color w:val="000000" w:themeColor="text1" w:themeTint="FF" w:themeShade="FF"/>
-          <w:sz w:val="24"/>
+        <w:spacing w:after="0"/>
+        <w:rPr>
+          <w:rFonts w:ascii="Times New Roman" w:eastAsia="Times New Roman" w:hAnsi="Times New Roman" w:cs="Times New Roman"/>
+          <w:color w:val="000000" w:themeColor="text1"/>
           <w:szCs w:val="24"/>
           <w:lang w:val="en-US"/>
         </w:rPr>
       </w:pPr>
       <w:r>
         <w:rPr>
-          <w:rFonts w:ascii="Times New Roman" w:hAnsi="Times New Roman" w:eastAsia="Times New Roman" w:cs="Times New Roman"/>
-          <w:noProof w:val="0"/>
-          <w:color w:val="000000" w:themeColor="text1" w:themeTint="FF" w:themeShade="FF"/>
-          <w:sz w:val="24"/>
+          <w:rFonts w:ascii="Times New Roman" w:eastAsia="Times New Roman" w:hAnsi="Times New Roman" w:cs="Times New Roman"/>
+          <w:color w:val="000000" w:themeColor="text1"/>
           <w:szCs w:val="24"/>
           <w:lang w:val="en-US"/>
         </w:rPr>
@@ -483,14 +415,12 @@
     </w:p>
     <w:p>
       <w:pPr>
-        <w:spacing w:before="240" w:beforeAutospacing="off" w:after="240" w:afterAutospacing="off"/>
+        <w:spacing w:before="240" w:after="240"/>
       </w:pPr>
       <w:r>
         <w:rPr>
-          <w:rFonts w:ascii="Times New Roman" w:hAnsi="Times New Roman" w:eastAsia="Times New Roman" w:cs="Times New Roman"/>
-          <w:noProof w:val="0"/>
-          <w:color w:val="000000" w:themeColor="text1" w:themeTint="FF" w:themeShade="FF"/>
-          <w:sz w:val="24"/>
+          <w:rFonts w:ascii="Times New Roman" w:eastAsia="Times New Roman" w:hAnsi="Times New Roman" w:cs="Times New Roman"/>
+          <w:color w:val="000000" w:themeColor="text1"/>
           <w:szCs w:val="24"/>
           <w:lang w:val="en-US"/>
         </w:rPr>
@@ -502,24 +432,20 @@
         <w:pStyle w:val="ListParagraph"/>
         <w:numPr>
           <w:ilvl w:val="0"/>
-          <w:numId w:val="8"/>
+          <w:numId w:val="1"/>
         </w:numPr>
-        <w:spacing w:before="0" w:beforeAutospacing="off" w:after="0" w:afterAutospacing="off"/>
-        <w:rPr>
-          <w:rFonts w:ascii="Times New Roman" w:hAnsi="Times New Roman" w:eastAsia="Times New Roman" w:cs="Times New Roman"/>
-          <w:noProof w:val="0"/>
-          <w:color w:val="000000" w:themeColor="text1" w:themeTint="FF" w:themeShade="FF"/>
-          <w:sz w:val="24"/>
+        <w:spacing w:after="0" w:line="240" w:lineRule="auto"/>
+        <w:rPr>
+          <w:rFonts w:ascii="Times New Roman" w:eastAsia="Times New Roman" w:hAnsi="Times New Roman" w:cs="Times New Roman"/>
+          <w:color w:val="000000" w:themeColor="text1"/>
           <w:szCs w:val="24"/>
           <w:lang w:val="en-US"/>
         </w:rPr>
       </w:pPr>
       <w:r>
         <w:rPr>
-          <w:rFonts w:ascii="Times New Roman" w:hAnsi="Times New Roman" w:eastAsia="Times New Roman" w:cs="Times New Roman"/>
-          <w:noProof w:val="0"/>
-          <w:color w:val="000000" w:themeColor="text1" w:themeTint="FF" w:themeShade="FF"/>
-          <w:sz w:val="24"/>
+          <w:rFonts w:ascii="Times New Roman" w:eastAsia="Times New Roman" w:hAnsi="Times New Roman" w:cs="Times New Roman"/>
+          <w:color w:val="000000" w:themeColor="text1"/>
           <w:szCs w:val="24"/>
           <w:lang w:val="en-US"/>
         </w:rPr>
@@ -531,63 +457,31 @@
         <w:pStyle w:val="ListParagraph"/>
         <w:numPr>
           <w:ilvl w:val="0"/>
-          <w:numId w:val="8"/>
+          <w:numId w:val="1"/>
         </w:numPr>
-        <w:spacing w:before="0" w:beforeAutospacing="off" w:after="0" w:afterAutospacing="off"/>
-        <w:rPr>
-          <w:rFonts w:ascii="Times New Roman" w:hAnsi="Times New Roman" w:eastAsia="Times New Roman" w:cs="Times New Roman"/>
-          <w:noProof w:val="0"/>
-          <w:color w:val="000000" w:themeColor="text1" w:themeTint="FF" w:themeShade="FF"/>
-          <w:sz w:val="24"/>
+        <w:spacing w:after="0" w:line="240" w:lineRule="auto"/>
+        <w:rPr>
+          <w:rFonts w:ascii="Times New Roman" w:eastAsia="Times New Roman" w:hAnsi="Times New Roman" w:cs="Times New Roman"/>
+          <w:color w:val="000000" w:themeColor="text1"/>
           <w:szCs w:val="24"/>
           <w:lang w:val="en-US"/>
         </w:rPr>
       </w:pPr>
       <w:r>
         <w:rPr>
-          <w:rFonts w:ascii="Times New Roman" w:hAnsi="Times New Roman" w:eastAsia="Times New Roman" w:cs="Times New Roman"/>
-          <w:noProof w:val="0"/>
-          <w:color w:val="000000" w:themeColor="text1" w:themeTint="FF" w:themeShade="FF"/>
-          <w:sz w:val="24"/>
+          <w:rFonts w:ascii="Times New Roman" w:eastAsia="Times New Roman" w:hAnsi="Times New Roman" w:cs="Times New Roman"/>
+          <w:color w:val="000000" w:themeColor="text1"/>
           <w:szCs w:val="24"/>
           <w:lang w:val="en-US"/>
         </w:rPr>
         <w:t>As a user, I want the robot to maintain a constant distance from its target person so that it does not move too close or too far away while following.</w:t>
       </w:r>
-    </w:p>
-    <w:p>
-      <w:pPr>
-        <w:pStyle w:val="Normal"/>
-        <w:spacing w:after="0"/>
-        <w:rPr>
-          <w:rFonts w:ascii="Times New Roman" w:hAnsi="Times New Roman" w:eastAsia="Times New Roman" w:cs="Times New Roman"/>
-          <w:lang w:val="en-US"/>
-        </w:rPr>
-      </w:pPr>
-    </w:p>
-    <w:p>
-      <w:pPr>
-        <w:pStyle w:val="Normal"/>
-        <w:ind w:left="360"/>
-        <w:rPr>
-          <w:rFonts w:ascii="-webkit-standard" w:hAnsi="-webkit-standard" w:eastAsia="-webkit-standard" w:cs="-webkit-standard"/>
-          <w:b w:val="0"/>
-          <w:bCs w:val="0"/>
-          <w:i w:val="0"/>
-          <w:iCs w:val="0"/>
-          <w:noProof w:val="0"/>
-          <w:color w:val="000000" w:themeColor="text1" w:themeTint="FF" w:themeShade="FF"/>
-          <w:sz w:val="24"/>
-          <w:szCs w:val="24"/>
-          <w:lang w:val="en-GB"/>
-        </w:rPr>
-      </w:pPr>
       <w:r>
         <w:br/>
       </w:r>
     </w:p>
     <w:sectPr>
-      <w:pgSz w:w="11906" w:h="16838" w:orient="portrait"/>
+      <w:pgSz w:w="11906" w:h="16838"/>
       <w:pgMar w:top="1440" w:right="1440" w:bottom="1440" w:left="1440" w:header="708" w:footer="708" w:gutter="0"/>
       <w:cols w:space="708"/>
       <w:docGrid w:linePitch="360"/>
@@ -597,11 +491,12 @@
 </file>
 
 <file path=word/numbering.xml><?xml version="1.0" encoding="utf-8"?>
-<w:numbering xmlns:wpc="http://schemas.microsoft.com/office/word/2010/wordprocessingCanvas" xmlns:cx="http://schemas.microsoft.com/office/drawing/2014/chartex" xmlns:cx1="http://schemas.microsoft.com/office/drawing/2015/9/8/chartex" xmlns:cx2="http://schemas.microsoft.com/office/drawing/2015/10/21/chartex" xmlns:cx3="http://schemas.microsoft.com/office/drawing/2016/5/9/chartex" xmlns:cx4="http://schemas.microsoft.com/office/drawing/2016/5/10/chartex" xmlns:cx5="http://schemas.microsoft.com/office/drawing/2016/5/11/chartex" xmlns:cx6="http://schemas.microsoft.com/office/drawing/2016/5/12/chartex" xmlns:cx7="http://schemas.microsoft.com/office/drawing/2016/5/13/chartex" xmlns:cx8="http://schemas.microsoft.com/office/drawing/2016/5/14/chartex" xmlns:mc="http://schemas.openxmlformats.org/markup-compatibility/2006" xmlns:m="http://schemas.openxmlformats.org/officeDocument/2006/math" xmlns:aink="http://schemas.microsoft.com/office/drawing/2016/ink" xmlns:am3d="http://schemas.microsoft.com/office/drawing/2017/model3d" xmlns:oel="http://schemas.microsoft.com/office/2019/extlst" xmlns:r="http://schemas.openxmlformats.org/officeDocument/2006/relationships" xmlns:wp14="http://schemas.microsoft.com/office/word/2010/wordprocessingDrawing" xmlns:wp="http://schemas.openxmlformats.org/drawingml/2006/wordprocessingDrawing" xmlns:wpg="http://schemas.microsoft.com/office/word/2010/wordprocessingGroup" xmlns:wpi="http://schemas.microsoft.com/office/word/2010/wordprocessingInk" xmlns:wps="http://schemas.microsoft.com/office/word/2010/wordprocessingShape" xmlns:o="urn:schemas-microsoft-com:office:office" xmlns:v="urn:schemas-microsoft-com:vml" xmlns:w10="urn:schemas-microsoft-com:office:word" xmlns:w="http://schemas.openxmlformats.org/wordprocessingml/2006/main" xmlns:w14="http://schemas.microsoft.com/office/word/2010/wordml" xmlns:w15="http://schemas.microsoft.com/office/word/2012/wordml" xmlns:w16cex="http://schemas.microsoft.com/office/word/2018/wordml/cex" xmlns:w16cid="http://schemas.microsoft.com/office/word/2016/wordml/cid" xmlns:w16="http://schemas.microsoft.com/office/word/2018/wordml" xmlns:w16sdtdh="http://schemas.microsoft.com/office/word/2020/wordml/sdtdatahash" xmlns:w16sdtfl="http://schemas.microsoft.com/office/word/2024/wordml/sdtformatlock" xmlns:w16se="http://schemas.microsoft.com/office/word/2015/wordml/symex" xmlns:w16du="http://schemas.microsoft.com/office/word/2023/wordml/word16du" xmlns:wne="http://schemas.microsoft.com/office/word/2006/wordml" mc:Ignorable="w14 w15 w16se w16cid w16 w16cex w16sdtdh w16sdtfl w16du wp14">
-  <w:abstractNum xmlns:w="http://schemas.openxmlformats.org/wordprocessingml/2006/main" w:abstractNumId="7">
-    <w:nsid w:val="2c320863"/>
-    <w:multiLevelType xmlns:w="http://schemas.openxmlformats.org/wordprocessingml/2006/main" w:val="hybridMultilevel"/>
-    <w:lvl xmlns:w="http://schemas.openxmlformats.org/wordprocessingml/2006/main" w:ilvl="0">
+<w:numbering xmlns:wpc="http://schemas.microsoft.com/office/word/2010/wordprocessingCanvas" xmlns:cx="http://schemas.microsoft.com/office/drawing/2014/chartex" xmlns:cx1="http://schemas.microsoft.com/office/drawing/2015/9/8/chartex" xmlns:cx2="http://schemas.microsoft.com/office/drawing/2015/10/21/chartex" xmlns:cx3="http://schemas.microsoft.com/office/drawing/2016/5/9/chartex" xmlns:cx4="http://schemas.microsoft.com/office/drawing/2016/5/10/chartex" xmlns:cx5="http://schemas.microsoft.com/office/drawing/2016/5/11/chartex" xmlns:cx6="http://schemas.microsoft.com/office/drawing/2016/5/12/chartex" xmlns:cx7="http://schemas.microsoft.com/office/drawing/2016/5/13/chartex" xmlns:cx8="http://schemas.microsoft.com/office/drawing/2016/5/14/chartex" xmlns:mc="http://schemas.openxmlformats.org/markup-compatibility/2006" xmlns:aink="http://schemas.microsoft.com/office/drawing/2016/ink" xmlns:am3d="http://schemas.microsoft.com/office/drawing/2017/model3d" xmlns:o="urn:schemas-microsoft-com:office:office" xmlns:oel="http://schemas.microsoft.com/office/2019/extlst" xmlns:r="http://schemas.openxmlformats.org/officeDocument/2006/relationships" xmlns:m="http://schemas.openxmlformats.org/officeDocument/2006/math" xmlns:v="urn:schemas-microsoft-com:vml" xmlns:wp14="http://schemas.microsoft.com/office/word/2010/wordprocessingDrawing" xmlns:wp="http://schemas.openxmlformats.org/drawingml/2006/wordprocessingDrawing" xmlns:w10="urn:schemas-microsoft-com:office:word" xmlns:w="http://schemas.openxmlformats.org/wordprocessingml/2006/main" xmlns:w14="http://schemas.microsoft.com/office/word/2010/wordml" xmlns:w15="http://schemas.microsoft.com/office/word/2012/wordml" xmlns:w16cei="http://schemas.microsoft.com/office/word/2026/wordml/cei" xmlns:w16cex="http://schemas.microsoft.com/office/word/2018/wordml/cex" xmlns:w16cid="http://schemas.microsoft.com/office/word/2016/wordml/cid" xmlns:w16="http://schemas.microsoft.com/office/word/2018/wordml" xmlns:w16du="http://schemas.microsoft.com/office/word/2023/wordml/word16du" xmlns:w16sdtdh="http://schemas.microsoft.com/office/word/2020/wordml/sdtdatahash" xmlns:w16sdtfl="http://schemas.microsoft.com/office/word/2024/wordml/sdtformatlock" xmlns:w16se="http://schemas.microsoft.com/office/word/2015/wordml/symex" xmlns:wpg="http://schemas.microsoft.com/office/word/2010/wordprocessingGroup" xmlns:wpi="http://schemas.microsoft.com/office/word/2010/wordprocessingInk" xmlns:wne="http://schemas.microsoft.com/office/word/2006/wordml" xmlns:wps="http://schemas.microsoft.com/office/word/2010/wordprocessingShape" mc:Ignorable="w14 w15 w16se w16cid w16 w16cex w16sdtdh w16sdtfl w16du wp14">
+  <w:abstractNum w:abstractNumId="0" w15:restartNumberingAfterBreak="0">
+    <w:nsid w:val="039CE0F0"/>
+    <w:multiLevelType w:val="hybridMultilevel"/>
+    <w:tmpl w:val="F6B29C16"/>
+    <w:lvl w:ilvl="0" w:tplc="8E7A5A4E">
       <w:start w:val="1"/>
       <w:numFmt w:val="decimal"/>
       <w:lvlText w:val="%1."/>
@@ -610,7 +505,7 @@
         <w:ind w:left="720" w:hanging="360"/>
       </w:pPr>
     </w:lvl>
-    <w:lvl xmlns:w="http://schemas.openxmlformats.org/wordprocessingml/2006/main" w:ilvl="1">
+    <w:lvl w:ilvl="1" w:tplc="E048B426">
       <w:start w:val="1"/>
       <w:numFmt w:val="lowerLetter"/>
       <w:lvlText w:val="%2."/>
@@ -619,7 +514,7 @@
         <w:ind w:left="1440" w:hanging="360"/>
       </w:pPr>
     </w:lvl>
-    <w:lvl xmlns:w="http://schemas.openxmlformats.org/wordprocessingml/2006/main" w:ilvl="2">
+    <w:lvl w:ilvl="2" w:tplc="8358705E">
       <w:start w:val="1"/>
       <w:numFmt w:val="lowerRoman"/>
       <w:lvlText w:val="%3."/>
@@ -628,7 +523,7 @@
         <w:ind w:left="2160" w:hanging="180"/>
       </w:pPr>
     </w:lvl>
-    <w:lvl xmlns:w="http://schemas.openxmlformats.org/wordprocessingml/2006/main" w:ilvl="3">
+    <w:lvl w:ilvl="3" w:tplc="644E6CEE">
       <w:start w:val="1"/>
       <w:numFmt w:val="decimal"/>
       <w:lvlText w:val="%4."/>
@@ -637,7 +532,7 @@
         <w:ind w:left="2880" w:hanging="360"/>
       </w:pPr>
     </w:lvl>
-    <w:lvl xmlns:w="http://schemas.openxmlformats.org/wordprocessingml/2006/main" w:ilvl="4">
+    <w:lvl w:ilvl="4" w:tplc="51E89B8E">
       <w:start w:val="1"/>
       <w:numFmt w:val="lowerLetter"/>
       <w:lvlText w:val="%5."/>
@@ -646,7 +541,7 @@
         <w:ind w:left="3600" w:hanging="360"/>
       </w:pPr>
     </w:lvl>
-    <w:lvl xmlns:w="http://schemas.openxmlformats.org/wordprocessingml/2006/main" w:ilvl="5">
+    <w:lvl w:ilvl="5" w:tplc="0D605892">
       <w:start w:val="1"/>
       <w:numFmt w:val="lowerRoman"/>
       <w:lvlText w:val="%6."/>
@@ -655,7 +550,7 @@
         <w:ind w:left="4320" w:hanging="180"/>
       </w:pPr>
     </w:lvl>
-    <w:lvl xmlns:w="http://schemas.openxmlformats.org/wordprocessingml/2006/main" w:ilvl="6">
+    <w:lvl w:ilvl="6" w:tplc="337219F2">
       <w:start w:val="1"/>
       <w:numFmt w:val="decimal"/>
       <w:lvlText w:val="%7."/>
@@ -664,7 +559,7 @@
         <w:ind w:left="5040" w:hanging="360"/>
       </w:pPr>
     </w:lvl>
-    <w:lvl xmlns:w="http://schemas.openxmlformats.org/wordprocessingml/2006/main" w:ilvl="7">
+    <w:lvl w:ilvl="7" w:tplc="A678C76C">
       <w:start w:val="1"/>
       <w:numFmt w:val="lowerLetter"/>
       <w:lvlText w:val="%8."/>
@@ -673,7 +568,7 @@
         <w:ind w:left="5760" w:hanging="360"/>
       </w:pPr>
     </w:lvl>
-    <w:lvl xmlns:w="http://schemas.openxmlformats.org/wordprocessingml/2006/main" w:ilvl="8">
+    <w:lvl w:ilvl="8" w:tplc="14F08D0A">
       <w:start w:val="1"/>
       <w:numFmt w:val="lowerRoman"/>
       <w:lvlText w:val="%9."/>
@@ -683,435 +578,7 @@
       </w:pPr>
     </w:lvl>
   </w:abstractNum>
-  <w:abstractNum xmlns:w="http://schemas.openxmlformats.org/wordprocessingml/2006/main" w:abstractNumId="6">
-    <w:nsid w:val="14cd319b"/>
-    <w:multiLevelType xmlns:w="http://schemas.openxmlformats.org/wordprocessingml/2006/main" w:val="hybridMultilevel"/>
-    <w:lvl xmlns:w="http://schemas.openxmlformats.org/wordprocessingml/2006/main" w:ilvl="0">
-      <w:start w:val="1"/>
-      <w:numFmt w:val="decimal"/>
-      <w:lvlText w:val="%1."/>
-      <w:lvlJc w:val="left"/>
-      <w:pPr>
-        <w:ind w:left="720" w:hanging="360"/>
-      </w:pPr>
-    </w:lvl>
-    <w:lvl xmlns:w="http://schemas.openxmlformats.org/wordprocessingml/2006/main" w:ilvl="1">
-      <w:start w:val="1"/>
-      <w:numFmt w:val="lowerLetter"/>
-      <w:lvlText w:val="%2."/>
-      <w:lvlJc w:val="left"/>
-      <w:pPr>
-        <w:ind w:left="1440" w:hanging="360"/>
-      </w:pPr>
-    </w:lvl>
-    <w:lvl xmlns:w="http://schemas.openxmlformats.org/wordprocessingml/2006/main" w:ilvl="2">
-      <w:start w:val="1"/>
-      <w:numFmt w:val="lowerRoman"/>
-      <w:lvlText w:val="%3."/>
-      <w:lvlJc w:val="right"/>
-      <w:pPr>
-        <w:ind w:left="2160" w:hanging="180"/>
-      </w:pPr>
-    </w:lvl>
-    <w:lvl xmlns:w="http://schemas.openxmlformats.org/wordprocessingml/2006/main" w:ilvl="3">
-      <w:start w:val="1"/>
-      <w:numFmt w:val="decimal"/>
-      <w:lvlText w:val="%4."/>
-      <w:lvlJc w:val="left"/>
-      <w:pPr>
-        <w:ind w:left="2880" w:hanging="360"/>
-      </w:pPr>
-    </w:lvl>
-    <w:lvl xmlns:w="http://schemas.openxmlformats.org/wordprocessingml/2006/main" w:ilvl="4">
-      <w:start w:val="1"/>
-      <w:numFmt w:val="lowerLetter"/>
-      <w:lvlText w:val="%5."/>
-      <w:lvlJc w:val="left"/>
-      <w:pPr>
-        <w:ind w:left="3600" w:hanging="360"/>
-      </w:pPr>
-    </w:lvl>
-    <w:lvl xmlns:w="http://schemas.openxmlformats.org/wordprocessingml/2006/main" w:ilvl="5">
-      <w:start w:val="1"/>
-      <w:numFmt w:val="lowerRoman"/>
-      <w:lvlText w:val="%6."/>
-      <w:lvlJc w:val="right"/>
-      <w:pPr>
-        <w:ind w:left="4320" w:hanging="180"/>
-      </w:pPr>
-    </w:lvl>
-    <w:lvl xmlns:w="http://schemas.openxmlformats.org/wordprocessingml/2006/main" w:ilvl="6">
-      <w:start w:val="1"/>
-      <w:numFmt w:val="decimal"/>
-      <w:lvlText w:val="%7."/>
-      <w:lvlJc w:val="left"/>
-      <w:pPr>
-        <w:ind w:left="5040" w:hanging="360"/>
-      </w:pPr>
-    </w:lvl>
-    <w:lvl xmlns:w="http://schemas.openxmlformats.org/wordprocessingml/2006/main" w:ilvl="7">
-      <w:start w:val="1"/>
-      <w:numFmt w:val="lowerLetter"/>
-      <w:lvlText w:val="%8."/>
-      <w:lvlJc w:val="left"/>
-      <w:pPr>
-        <w:ind w:left="5760" w:hanging="360"/>
-      </w:pPr>
-    </w:lvl>
-    <w:lvl xmlns:w="http://schemas.openxmlformats.org/wordprocessingml/2006/main" w:ilvl="8">
-      <w:start w:val="1"/>
-      <w:numFmt w:val="lowerRoman"/>
-      <w:lvlText w:val="%9."/>
-      <w:lvlJc w:val="right"/>
-      <w:pPr>
-        <w:ind w:left="6480" w:hanging="180"/>
-      </w:pPr>
-    </w:lvl>
-  </w:abstractNum>
-  <w:abstractNum xmlns:w="http://schemas.openxmlformats.org/wordprocessingml/2006/main" w:abstractNumId="5">
-    <w:nsid w:val="6a66ea93"/>
-    <w:multiLevelType xmlns:w="http://schemas.openxmlformats.org/wordprocessingml/2006/main" w:val="hybridMultilevel"/>
-    <w:lvl xmlns:w="http://schemas.openxmlformats.org/wordprocessingml/2006/main" w:ilvl="0">
-      <w:start w:val="1"/>
-      <w:numFmt w:val="decimal"/>
-      <w:lvlText w:val="%1."/>
-      <w:lvlJc w:val="left"/>
-      <w:pPr>
-        <w:ind w:left="720" w:hanging="360"/>
-      </w:pPr>
-    </w:lvl>
-    <w:lvl xmlns:w="http://schemas.openxmlformats.org/wordprocessingml/2006/main" w:ilvl="1">
-      <w:start w:val="1"/>
-      <w:numFmt w:val="lowerLetter"/>
-      <w:lvlText w:val="%2."/>
-      <w:lvlJc w:val="left"/>
-      <w:pPr>
-        <w:ind w:left="1440" w:hanging="360"/>
-      </w:pPr>
-    </w:lvl>
-    <w:lvl xmlns:w="http://schemas.openxmlformats.org/wordprocessingml/2006/main" w:ilvl="2">
-      <w:start w:val="1"/>
-      <w:numFmt w:val="lowerRoman"/>
-      <w:lvlText w:val="%3."/>
-      <w:lvlJc w:val="right"/>
-      <w:pPr>
-        <w:ind w:left="2160" w:hanging="180"/>
-      </w:pPr>
-    </w:lvl>
-    <w:lvl xmlns:w="http://schemas.openxmlformats.org/wordprocessingml/2006/main" w:ilvl="3">
-      <w:start w:val="1"/>
-      <w:numFmt w:val="decimal"/>
-      <w:lvlText w:val="%4."/>
-      <w:lvlJc w:val="left"/>
-      <w:pPr>
-        <w:ind w:left="2880" w:hanging="360"/>
-      </w:pPr>
-    </w:lvl>
-    <w:lvl xmlns:w="http://schemas.openxmlformats.org/wordprocessingml/2006/main" w:ilvl="4">
-      <w:start w:val="1"/>
-      <w:numFmt w:val="lowerLetter"/>
-      <w:lvlText w:val="%5."/>
-      <w:lvlJc w:val="left"/>
-      <w:pPr>
-        <w:ind w:left="3600" w:hanging="360"/>
-      </w:pPr>
-    </w:lvl>
-    <w:lvl xmlns:w="http://schemas.openxmlformats.org/wordprocessingml/2006/main" w:ilvl="5">
-      <w:start w:val="1"/>
-      <w:numFmt w:val="lowerRoman"/>
-      <w:lvlText w:val="%6."/>
-      <w:lvlJc w:val="right"/>
-      <w:pPr>
-        <w:ind w:left="4320" w:hanging="180"/>
-      </w:pPr>
-    </w:lvl>
-    <w:lvl xmlns:w="http://schemas.openxmlformats.org/wordprocessingml/2006/main" w:ilvl="6">
-      <w:start w:val="1"/>
-      <w:numFmt w:val="decimal"/>
-      <w:lvlText w:val="%7."/>
-      <w:lvlJc w:val="left"/>
-      <w:pPr>
-        <w:ind w:left="5040" w:hanging="360"/>
-      </w:pPr>
-    </w:lvl>
-    <w:lvl xmlns:w="http://schemas.openxmlformats.org/wordprocessingml/2006/main" w:ilvl="7">
-      <w:start w:val="1"/>
-      <w:numFmt w:val="lowerLetter"/>
-      <w:lvlText w:val="%8."/>
-      <w:lvlJc w:val="left"/>
-      <w:pPr>
-        <w:ind w:left="5760" w:hanging="360"/>
-      </w:pPr>
-    </w:lvl>
-    <w:lvl xmlns:w="http://schemas.openxmlformats.org/wordprocessingml/2006/main" w:ilvl="8">
-      <w:start w:val="1"/>
-      <w:numFmt w:val="lowerRoman"/>
-      <w:lvlText w:val="%9."/>
-      <w:lvlJc w:val="right"/>
-      <w:pPr>
-        <w:ind w:left="6480" w:hanging="180"/>
-      </w:pPr>
-    </w:lvl>
-  </w:abstractNum>
-  <w:abstractNum xmlns:w="http://schemas.openxmlformats.org/wordprocessingml/2006/main" w:abstractNumId="4">
-    <w:nsid w:val="39ce0f0"/>
-    <w:multiLevelType xmlns:w="http://schemas.openxmlformats.org/wordprocessingml/2006/main" w:val="hybridMultilevel"/>
-    <w:lvl xmlns:w="http://schemas.openxmlformats.org/wordprocessingml/2006/main" w:ilvl="0">
-      <w:start w:val="1"/>
-      <w:numFmt w:val="decimal"/>
-      <w:lvlText w:val="%1."/>
-      <w:lvlJc w:val="left"/>
-      <w:pPr>
-        <w:ind w:left="720" w:hanging="360"/>
-      </w:pPr>
-    </w:lvl>
-    <w:lvl xmlns:w="http://schemas.openxmlformats.org/wordprocessingml/2006/main" w:ilvl="1">
-      <w:start w:val="1"/>
-      <w:numFmt w:val="lowerLetter"/>
-      <w:lvlText w:val="%2."/>
-      <w:lvlJc w:val="left"/>
-      <w:pPr>
-        <w:ind w:left="1440" w:hanging="360"/>
-      </w:pPr>
-    </w:lvl>
-    <w:lvl xmlns:w="http://schemas.openxmlformats.org/wordprocessingml/2006/main" w:ilvl="2">
-      <w:start w:val="1"/>
-      <w:numFmt w:val="lowerRoman"/>
-      <w:lvlText w:val="%3."/>
-      <w:lvlJc w:val="right"/>
-      <w:pPr>
-        <w:ind w:left="2160" w:hanging="180"/>
-      </w:pPr>
-    </w:lvl>
-    <w:lvl xmlns:w="http://schemas.openxmlformats.org/wordprocessingml/2006/main" w:ilvl="3">
-      <w:start w:val="1"/>
-      <w:numFmt w:val="decimal"/>
-      <w:lvlText w:val="%4."/>
-      <w:lvlJc w:val="left"/>
-      <w:pPr>
-        <w:ind w:left="2880" w:hanging="360"/>
-      </w:pPr>
-    </w:lvl>
-    <w:lvl xmlns:w="http://schemas.openxmlformats.org/wordprocessingml/2006/main" w:ilvl="4">
-      <w:start w:val="1"/>
-      <w:numFmt w:val="lowerLetter"/>
-      <w:lvlText w:val="%5."/>
-      <w:lvlJc w:val="left"/>
-      <w:pPr>
-        <w:ind w:left="3600" w:hanging="360"/>
-      </w:pPr>
-    </w:lvl>
-    <w:lvl xmlns:w="http://schemas.openxmlformats.org/wordprocessingml/2006/main" w:ilvl="5">
-      <w:start w:val="1"/>
-      <w:numFmt w:val="lowerRoman"/>
-      <w:lvlText w:val="%6."/>
-      <w:lvlJc w:val="right"/>
-      <w:pPr>
-        <w:ind w:left="4320" w:hanging="180"/>
-      </w:pPr>
-    </w:lvl>
-    <w:lvl xmlns:w="http://schemas.openxmlformats.org/wordprocessingml/2006/main" w:ilvl="6">
-      <w:start w:val="1"/>
-      <w:numFmt w:val="decimal"/>
-      <w:lvlText w:val="%7."/>
-      <w:lvlJc w:val="left"/>
-      <w:pPr>
-        <w:ind w:left="5040" w:hanging="360"/>
-      </w:pPr>
-    </w:lvl>
-    <w:lvl xmlns:w="http://schemas.openxmlformats.org/wordprocessingml/2006/main" w:ilvl="7">
-      <w:start w:val="1"/>
-      <w:numFmt w:val="lowerLetter"/>
-      <w:lvlText w:val="%8."/>
-      <w:lvlJc w:val="left"/>
-      <w:pPr>
-        <w:ind w:left="5760" w:hanging="360"/>
-      </w:pPr>
-    </w:lvl>
-    <w:lvl xmlns:w="http://schemas.openxmlformats.org/wordprocessingml/2006/main" w:ilvl="8">
-      <w:start w:val="1"/>
-      <w:numFmt w:val="lowerRoman"/>
-      <w:lvlText w:val="%9."/>
-      <w:lvlJc w:val="right"/>
-      <w:pPr>
-        <w:ind w:left="6480" w:hanging="180"/>
-      </w:pPr>
-    </w:lvl>
-  </w:abstractNum>
-  <w:abstractNum xmlns:w="http://schemas.openxmlformats.org/wordprocessingml/2006/main" w:abstractNumId="3">
-    <w:nsid w:val="7472a116"/>
-    <w:multiLevelType xmlns:w="http://schemas.openxmlformats.org/wordprocessingml/2006/main" w:val="hybridMultilevel"/>
-    <w:lvl xmlns:w="http://schemas.openxmlformats.org/wordprocessingml/2006/main" w:ilvl="0">
-      <w:start w:val="5"/>
-      <w:numFmt w:val="decimal"/>
-      <w:lvlText w:val="%1."/>
-      <w:lvlJc w:val="left"/>
-      <w:pPr>
-        <w:ind w:left="720" w:hanging="360"/>
-      </w:pPr>
-      <w:rPr>
-        <w:rFonts w:hint="default" w:ascii="Times New Roman" w:hAnsi="Times New Roman"/>
-      </w:rPr>
-    </w:lvl>
-    <w:lvl xmlns:w="http://schemas.openxmlformats.org/wordprocessingml/2006/main" w:ilvl="1">
-      <w:start w:val="1"/>
-      <w:numFmt w:val="lowerLetter"/>
-      <w:lvlText w:val="%2."/>
-      <w:lvlJc w:val="left"/>
-      <w:pPr>
-        <w:ind w:left="1440" w:hanging="360"/>
-      </w:pPr>
-    </w:lvl>
-    <w:lvl xmlns:w="http://schemas.openxmlformats.org/wordprocessingml/2006/main" w:ilvl="2">
-      <w:start w:val="1"/>
-      <w:numFmt w:val="lowerRoman"/>
-      <w:lvlText w:val="%3."/>
-      <w:lvlJc w:val="right"/>
-      <w:pPr>
-        <w:ind w:left="2160" w:hanging="180"/>
-      </w:pPr>
-    </w:lvl>
-    <w:lvl xmlns:w="http://schemas.openxmlformats.org/wordprocessingml/2006/main" w:ilvl="3">
-      <w:start w:val="1"/>
-      <w:numFmt w:val="decimal"/>
-      <w:lvlText w:val="%4."/>
-      <w:lvlJc w:val="left"/>
-      <w:pPr>
-        <w:ind w:left="2880" w:hanging="360"/>
-      </w:pPr>
-    </w:lvl>
-    <w:lvl xmlns:w="http://schemas.openxmlformats.org/wordprocessingml/2006/main" w:ilvl="4">
-      <w:start w:val="1"/>
-      <w:numFmt w:val="lowerLetter"/>
-      <w:lvlText w:val="%5."/>
-      <w:lvlJc w:val="left"/>
-      <w:pPr>
-        <w:ind w:left="3600" w:hanging="360"/>
-      </w:pPr>
-    </w:lvl>
-    <w:lvl xmlns:w="http://schemas.openxmlformats.org/wordprocessingml/2006/main" w:ilvl="5">
-      <w:start w:val="1"/>
-      <w:numFmt w:val="lowerRoman"/>
-      <w:lvlText w:val="%6."/>
-      <w:lvlJc w:val="right"/>
-      <w:pPr>
-        <w:ind w:left="4320" w:hanging="180"/>
-      </w:pPr>
-    </w:lvl>
-    <w:lvl xmlns:w="http://schemas.openxmlformats.org/wordprocessingml/2006/main" w:ilvl="6">
-      <w:start w:val="1"/>
-      <w:numFmt w:val="decimal"/>
-      <w:lvlText w:val="%7."/>
-      <w:lvlJc w:val="left"/>
-      <w:pPr>
-        <w:ind w:left="5040" w:hanging="360"/>
-      </w:pPr>
-    </w:lvl>
-    <w:lvl xmlns:w="http://schemas.openxmlformats.org/wordprocessingml/2006/main" w:ilvl="7">
-      <w:start w:val="1"/>
-      <w:numFmt w:val="lowerLetter"/>
-      <w:lvlText w:val="%8."/>
-      <w:lvlJc w:val="left"/>
-      <w:pPr>
-        <w:ind w:left="5760" w:hanging="360"/>
-      </w:pPr>
-    </w:lvl>
-    <w:lvl xmlns:w="http://schemas.openxmlformats.org/wordprocessingml/2006/main" w:ilvl="8">
-      <w:start w:val="1"/>
-      <w:numFmt w:val="lowerRoman"/>
-      <w:lvlText w:val="%9."/>
-      <w:lvlJc w:val="right"/>
-      <w:pPr>
-        <w:ind w:left="6480" w:hanging="180"/>
-      </w:pPr>
-    </w:lvl>
-  </w:abstractNum>
-  <w:abstractNum xmlns:w="http://schemas.openxmlformats.org/wordprocessingml/2006/main" w:abstractNumId="2">
-    <w:nsid w:val="541fa7fb"/>
-    <w:multiLevelType xmlns:w="http://schemas.openxmlformats.org/wordprocessingml/2006/main" w:val="hybridMultilevel"/>
-    <w:lvl xmlns:w="http://schemas.openxmlformats.org/wordprocessingml/2006/main" w:ilvl="0">
-      <w:start w:val="1"/>
-      <w:numFmt w:val="decimal"/>
-      <w:lvlText w:val="%1."/>
-      <w:lvlJc w:val="left"/>
-      <w:pPr>
-        <w:ind w:left="720" w:hanging="360"/>
-      </w:pPr>
-    </w:lvl>
-    <w:lvl xmlns:w="http://schemas.openxmlformats.org/wordprocessingml/2006/main" w:ilvl="1">
-      <w:start w:val="1"/>
-      <w:numFmt w:val="lowerLetter"/>
-      <w:lvlText w:val="%2."/>
-      <w:lvlJc w:val="left"/>
-      <w:pPr>
-        <w:ind w:left="1440" w:hanging="360"/>
-      </w:pPr>
-    </w:lvl>
-    <w:lvl xmlns:w="http://schemas.openxmlformats.org/wordprocessingml/2006/main" w:ilvl="2">
-      <w:start w:val="1"/>
-      <w:numFmt w:val="lowerRoman"/>
-      <w:lvlText w:val="%3."/>
-      <w:lvlJc w:val="right"/>
-      <w:pPr>
-        <w:ind w:left="2160" w:hanging="180"/>
-      </w:pPr>
-    </w:lvl>
-    <w:lvl xmlns:w="http://schemas.openxmlformats.org/wordprocessingml/2006/main" w:ilvl="3">
-      <w:start w:val="1"/>
-      <w:numFmt w:val="decimal"/>
-      <w:lvlText w:val="%4."/>
-      <w:lvlJc w:val="left"/>
-      <w:pPr>
-        <w:ind w:left="2880" w:hanging="360"/>
-      </w:pPr>
-    </w:lvl>
-    <w:lvl xmlns:w="http://schemas.openxmlformats.org/wordprocessingml/2006/main" w:ilvl="4">
-      <w:start w:val="1"/>
-      <w:numFmt w:val="lowerLetter"/>
-      <w:lvlText w:val="%5."/>
-      <w:lvlJc w:val="left"/>
-      <w:pPr>
-        <w:ind w:left="3600" w:hanging="360"/>
-      </w:pPr>
-    </w:lvl>
-    <w:lvl xmlns:w="http://schemas.openxmlformats.org/wordprocessingml/2006/main" w:ilvl="5">
-      <w:start w:val="1"/>
-      <w:numFmt w:val="lowerRoman"/>
-      <w:lvlText w:val="%6."/>
-      <w:lvlJc w:val="right"/>
-      <w:pPr>
-        <w:ind w:left="4320" w:hanging="180"/>
-      </w:pPr>
-    </w:lvl>
-    <w:lvl xmlns:w="http://schemas.openxmlformats.org/wordprocessingml/2006/main" w:ilvl="6">
-      <w:start w:val="1"/>
-      <w:numFmt w:val="decimal"/>
-      <w:lvlText w:val="%7."/>
-      <w:lvlJc w:val="left"/>
-      <w:pPr>
-        <w:ind w:left="5040" w:hanging="360"/>
-      </w:pPr>
-    </w:lvl>
-    <w:lvl xmlns:w="http://schemas.openxmlformats.org/wordprocessingml/2006/main" w:ilvl="7">
-      <w:start w:val="1"/>
-      <w:numFmt w:val="lowerLetter"/>
-      <w:lvlText w:val="%8."/>
-      <w:lvlJc w:val="left"/>
-      <w:pPr>
-        <w:ind w:left="5760" w:hanging="360"/>
-      </w:pPr>
-    </w:lvl>
-    <w:lvl xmlns:w="http://schemas.openxmlformats.org/wordprocessingml/2006/main" w:ilvl="8">
-      <w:start w:val="1"/>
-      <w:numFmt w:val="lowerRoman"/>
-      <w:lvlText w:val="%9."/>
-      <w:lvlJc w:val="right"/>
-      <w:pPr>
-        <w:ind w:left="6480" w:hanging="180"/>
-      </w:pPr>
-    </w:lvl>
-  </w:abstractNum>
-  <w:abstractNum w:abstractNumId="0" w15:restartNumberingAfterBreak="0">
+  <w:abstractNum w:abstractNumId="1" w15:restartNumberingAfterBreak="0">
     <w:nsid w:val="0CFA77BA"/>
     <w:multiLevelType w:val="hybridMultilevel"/>
     <w:tmpl w:val="10307A9A"/>
@@ -1200,7 +667,351 @@
       </w:pPr>
     </w:lvl>
   </w:abstractNum>
-  <w:abstractNum w:abstractNumId="1" w15:restartNumberingAfterBreak="0">
+  <w:abstractNum w:abstractNumId="2" w15:restartNumberingAfterBreak="0">
+    <w:nsid w:val="14CD319B"/>
+    <w:multiLevelType w:val="hybridMultilevel"/>
+    <w:tmpl w:val="EBE0B77E"/>
+    <w:lvl w:ilvl="0" w:tplc="F87C3B8C">
+      <w:start w:val="1"/>
+      <w:numFmt w:val="decimal"/>
+      <w:lvlText w:val="%1."/>
+      <w:lvlJc w:val="left"/>
+      <w:pPr>
+        <w:ind w:left="720" w:hanging="360"/>
+      </w:pPr>
+    </w:lvl>
+    <w:lvl w:ilvl="1" w:tplc="CC648FBC">
+      <w:start w:val="1"/>
+      <w:numFmt w:val="lowerLetter"/>
+      <w:lvlText w:val="%2."/>
+      <w:lvlJc w:val="left"/>
+      <w:pPr>
+        <w:ind w:left="1440" w:hanging="360"/>
+      </w:pPr>
+    </w:lvl>
+    <w:lvl w:ilvl="2" w:tplc="C17078D0">
+      <w:start w:val="1"/>
+      <w:numFmt w:val="lowerRoman"/>
+      <w:lvlText w:val="%3."/>
+      <w:lvlJc w:val="right"/>
+      <w:pPr>
+        <w:ind w:left="2160" w:hanging="180"/>
+      </w:pPr>
+    </w:lvl>
+    <w:lvl w:ilvl="3" w:tplc="1E90E888">
+      <w:start w:val="1"/>
+      <w:numFmt w:val="decimal"/>
+      <w:lvlText w:val="%4."/>
+      <w:lvlJc w:val="left"/>
+      <w:pPr>
+        <w:ind w:left="2880" w:hanging="360"/>
+      </w:pPr>
+    </w:lvl>
+    <w:lvl w:ilvl="4" w:tplc="2A46074C">
+      <w:start w:val="1"/>
+      <w:numFmt w:val="lowerLetter"/>
+      <w:lvlText w:val="%5."/>
+      <w:lvlJc w:val="left"/>
+      <w:pPr>
+        <w:ind w:left="3600" w:hanging="360"/>
+      </w:pPr>
+    </w:lvl>
+    <w:lvl w:ilvl="5" w:tplc="59826720">
+      <w:start w:val="1"/>
+      <w:numFmt w:val="lowerRoman"/>
+      <w:lvlText w:val="%6."/>
+      <w:lvlJc w:val="right"/>
+      <w:pPr>
+        <w:ind w:left="4320" w:hanging="180"/>
+      </w:pPr>
+    </w:lvl>
+    <w:lvl w:ilvl="6" w:tplc="95B00C26">
+      <w:start w:val="1"/>
+      <w:numFmt w:val="decimal"/>
+      <w:lvlText w:val="%7."/>
+      <w:lvlJc w:val="left"/>
+      <w:pPr>
+        <w:ind w:left="5040" w:hanging="360"/>
+      </w:pPr>
+    </w:lvl>
+    <w:lvl w:ilvl="7" w:tplc="64E07206">
+      <w:start w:val="1"/>
+      <w:numFmt w:val="lowerLetter"/>
+      <w:lvlText w:val="%8."/>
+      <w:lvlJc w:val="left"/>
+      <w:pPr>
+        <w:ind w:left="5760" w:hanging="360"/>
+      </w:pPr>
+    </w:lvl>
+    <w:lvl w:ilvl="8" w:tplc="C6C4FCFA">
+      <w:start w:val="1"/>
+      <w:numFmt w:val="lowerRoman"/>
+      <w:lvlText w:val="%9."/>
+      <w:lvlJc w:val="right"/>
+      <w:pPr>
+        <w:ind w:left="6480" w:hanging="180"/>
+      </w:pPr>
+    </w:lvl>
+  </w:abstractNum>
+  <w:abstractNum w:abstractNumId="3" w15:restartNumberingAfterBreak="0">
+    <w:nsid w:val="2C320863"/>
+    <w:multiLevelType w:val="hybridMultilevel"/>
+    <w:tmpl w:val="47609F8A"/>
+    <w:lvl w:ilvl="0" w:tplc="EAA2D3FA">
+      <w:start w:val="1"/>
+      <w:numFmt w:val="decimal"/>
+      <w:lvlText w:val="%1."/>
+      <w:lvlJc w:val="left"/>
+      <w:pPr>
+        <w:ind w:left="720" w:hanging="360"/>
+      </w:pPr>
+    </w:lvl>
+    <w:lvl w:ilvl="1" w:tplc="AD2E5B3C">
+      <w:start w:val="1"/>
+      <w:numFmt w:val="lowerLetter"/>
+      <w:lvlText w:val="%2."/>
+      <w:lvlJc w:val="left"/>
+      <w:pPr>
+        <w:ind w:left="1440" w:hanging="360"/>
+      </w:pPr>
+    </w:lvl>
+    <w:lvl w:ilvl="2" w:tplc="92AA0414">
+      <w:start w:val="1"/>
+      <w:numFmt w:val="lowerRoman"/>
+      <w:lvlText w:val="%3."/>
+      <w:lvlJc w:val="right"/>
+      <w:pPr>
+        <w:ind w:left="2160" w:hanging="180"/>
+      </w:pPr>
+    </w:lvl>
+    <w:lvl w:ilvl="3" w:tplc="D21ACE54">
+      <w:start w:val="1"/>
+      <w:numFmt w:val="decimal"/>
+      <w:lvlText w:val="%4."/>
+      <w:lvlJc w:val="left"/>
+      <w:pPr>
+        <w:ind w:left="2880" w:hanging="360"/>
+      </w:pPr>
+    </w:lvl>
+    <w:lvl w:ilvl="4" w:tplc="2270648A">
+      <w:start w:val="1"/>
+      <w:numFmt w:val="lowerLetter"/>
+      <w:lvlText w:val="%5."/>
+      <w:lvlJc w:val="left"/>
+      <w:pPr>
+        <w:ind w:left="3600" w:hanging="360"/>
+      </w:pPr>
+    </w:lvl>
+    <w:lvl w:ilvl="5" w:tplc="5BD6B036">
+      <w:start w:val="1"/>
+      <w:numFmt w:val="lowerRoman"/>
+      <w:lvlText w:val="%6."/>
+      <w:lvlJc w:val="right"/>
+      <w:pPr>
+        <w:ind w:left="4320" w:hanging="180"/>
+      </w:pPr>
+    </w:lvl>
+    <w:lvl w:ilvl="6" w:tplc="9364E812">
+      <w:start w:val="1"/>
+      <w:numFmt w:val="decimal"/>
+      <w:lvlText w:val="%7."/>
+      <w:lvlJc w:val="left"/>
+      <w:pPr>
+        <w:ind w:left="5040" w:hanging="360"/>
+      </w:pPr>
+    </w:lvl>
+    <w:lvl w:ilvl="7" w:tplc="8D022876">
+      <w:start w:val="1"/>
+      <w:numFmt w:val="lowerLetter"/>
+      <w:lvlText w:val="%8."/>
+      <w:lvlJc w:val="left"/>
+      <w:pPr>
+        <w:ind w:left="5760" w:hanging="360"/>
+      </w:pPr>
+    </w:lvl>
+    <w:lvl w:ilvl="8" w:tplc="C17661A6">
+      <w:start w:val="1"/>
+      <w:numFmt w:val="lowerRoman"/>
+      <w:lvlText w:val="%9."/>
+      <w:lvlJc w:val="right"/>
+      <w:pPr>
+        <w:ind w:left="6480" w:hanging="180"/>
+      </w:pPr>
+    </w:lvl>
+  </w:abstractNum>
+  <w:abstractNum w:abstractNumId="4" w15:restartNumberingAfterBreak="0">
+    <w:nsid w:val="541FA7FB"/>
+    <w:multiLevelType w:val="hybridMultilevel"/>
+    <w:tmpl w:val="46CA0BA2"/>
+    <w:lvl w:ilvl="0" w:tplc="A3F44B6A">
+      <w:start w:val="1"/>
+      <w:numFmt w:val="decimal"/>
+      <w:lvlText w:val="%1."/>
+      <w:lvlJc w:val="left"/>
+      <w:pPr>
+        <w:ind w:left="720" w:hanging="360"/>
+      </w:pPr>
+    </w:lvl>
+    <w:lvl w:ilvl="1" w:tplc="7F76678C">
+      <w:start w:val="1"/>
+      <w:numFmt w:val="lowerLetter"/>
+      <w:lvlText w:val="%2."/>
+      <w:lvlJc w:val="left"/>
+      <w:pPr>
+        <w:ind w:left="1440" w:hanging="360"/>
+      </w:pPr>
+    </w:lvl>
+    <w:lvl w:ilvl="2" w:tplc="CEA2DAD4">
+      <w:start w:val="1"/>
+      <w:numFmt w:val="lowerRoman"/>
+      <w:lvlText w:val="%3."/>
+      <w:lvlJc w:val="right"/>
+      <w:pPr>
+        <w:ind w:left="2160" w:hanging="180"/>
+      </w:pPr>
+    </w:lvl>
+    <w:lvl w:ilvl="3" w:tplc="79E01C6A">
+      <w:start w:val="1"/>
+      <w:numFmt w:val="decimal"/>
+      <w:lvlText w:val="%4."/>
+      <w:lvlJc w:val="left"/>
+      <w:pPr>
+        <w:ind w:left="2880" w:hanging="360"/>
+      </w:pPr>
+    </w:lvl>
+    <w:lvl w:ilvl="4" w:tplc="6EE0058E">
+      <w:start w:val="1"/>
+      <w:numFmt w:val="lowerLetter"/>
+      <w:lvlText w:val="%5."/>
+      <w:lvlJc w:val="left"/>
+      <w:pPr>
+        <w:ind w:left="3600" w:hanging="360"/>
+      </w:pPr>
+    </w:lvl>
+    <w:lvl w:ilvl="5" w:tplc="73A4DD4A">
+      <w:start w:val="1"/>
+      <w:numFmt w:val="lowerRoman"/>
+      <w:lvlText w:val="%6."/>
+      <w:lvlJc w:val="right"/>
+      <w:pPr>
+        <w:ind w:left="4320" w:hanging="180"/>
+      </w:pPr>
+    </w:lvl>
+    <w:lvl w:ilvl="6" w:tplc="2094284C">
+      <w:start w:val="1"/>
+      <w:numFmt w:val="decimal"/>
+      <w:lvlText w:val="%7."/>
+      <w:lvlJc w:val="left"/>
+      <w:pPr>
+        <w:ind w:left="5040" w:hanging="360"/>
+      </w:pPr>
+    </w:lvl>
+    <w:lvl w:ilvl="7" w:tplc="65BC3B04">
+      <w:start w:val="1"/>
+      <w:numFmt w:val="lowerLetter"/>
+      <w:lvlText w:val="%8."/>
+      <w:lvlJc w:val="left"/>
+      <w:pPr>
+        <w:ind w:left="5760" w:hanging="360"/>
+      </w:pPr>
+    </w:lvl>
+    <w:lvl w:ilvl="8" w:tplc="802CA394">
+      <w:start w:val="1"/>
+      <w:numFmt w:val="lowerRoman"/>
+      <w:lvlText w:val="%9."/>
+      <w:lvlJc w:val="right"/>
+      <w:pPr>
+        <w:ind w:left="6480" w:hanging="180"/>
+      </w:pPr>
+    </w:lvl>
+  </w:abstractNum>
+  <w:abstractNum w:abstractNumId="5" w15:restartNumberingAfterBreak="0">
+    <w:nsid w:val="6A66EA93"/>
+    <w:multiLevelType w:val="hybridMultilevel"/>
+    <w:tmpl w:val="AFA4CE36"/>
+    <w:lvl w:ilvl="0" w:tplc="80B2915A">
+      <w:start w:val="1"/>
+      <w:numFmt w:val="decimal"/>
+      <w:lvlText w:val="%1."/>
+      <w:lvlJc w:val="left"/>
+      <w:pPr>
+        <w:ind w:left="720" w:hanging="360"/>
+      </w:pPr>
+    </w:lvl>
+    <w:lvl w:ilvl="1" w:tplc="C8DC2D6C">
+      <w:start w:val="1"/>
+      <w:numFmt w:val="lowerLetter"/>
+      <w:lvlText w:val="%2."/>
+      <w:lvlJc w:val="left"/>
+      <w:pPr>
+        <w:ind w:left="1440" w:hanging="360"/>
+      </w:pPr>
+    </w:lvl>
+    <w:lvl w:ilvl="2" w:tplc="11B49828">
+      <w:start w:val="1"/>
+      <w:numFmt w:val="lowerRoman"/>
+      <w:lvlText w:val="%3."/>
+      <w:lvlJc w:val="right"/>
+      <w:pPr>
+        <w:ind w:left="2160" w:hanging="180"/>
+      </w:pPr>
+    </w:lvl>
+    <w:lvl w:ilvl="3" w:tplc="E38275FE">
+      <w:start w:val="1"/>
+      <w:numFmt w:val="decimal"/>
+      <w:lvlText w:val="%4."/>
+      <w:lvlJc w:val="left"/>
+      <w:pPr>
+        <w:ind w:left="2880" w:hanging="360"/>
+      </w:pPr>
+    </w:lvl>
+    <w:lvl w:ilvl="4" w:tplc="26F60EFE">
+      <w:start w:val="1"/>
+      <w:numFmt w:val="lowerLetter"/>
+      <w:lvlText w:val="%5."/>
+      <w:lvlJc w:val="left"/>
+      <w:pPr>
+        <w:ind w:left="3600" w:hanging="360"/>
+      </w:pPr>
+    </w:lvl>
+    <w:lvl w:ilvl="5" w:tplc="98AC94FE">
+      <w:start w:val="1"/>
+      <w:numFmt w:val="lowerRoman"/>
+      <w:lvlText w:val="%6."/>
+      <w:lvlJc w:val="right"/>
+      <w:pPr>
+        <w:ind w:left="4320" w:hanging="180"/>
+      </w:pPr>
+    </w:lvl>
+    <w:lvl w:ilvl="6" w:tplc="4104A448">
+      <w:start w:val="1"/>
+      <w:numFmt w:val="decimal"/>
+      <w:lvlText w:val="%7."/>
+      <w:lvlJc w:val="left"/>
+      <w:pPr>
+        <w:ind w:left="5040" w:hanging="360"/>
+      </w:pPr>
+    </w:lvl>
+    <w:lvl w:ilvl="7" w:tplc="E0D020E0">
+      <w:start w:val="1"/>
+      <w:numFmt w:val="lowerLetter"/>
+      <w:lvlText w:val="%8."/>
+      <w:lvlJc w:val="left"/>
+      <w:pPr>
+        <w:ind w:left="5760" w:hanging="360"/>
+      </w:pPr>
+    </w:lvl>
+    <w:lvl w:ilvl="8" w:tplc="8974983E">
+      <w:start w:val="1"/>
+      <w:numFmt w:val="lowerRoman"/>
+      <w:lvlText w:val="%9."/>
+      <w:lvlJc w:val="right"/>
+      <w:pPr>
+        <w:ind w:left="6480" w:hanging="180"/>
+      </w:pPr>
+    </w:lvl>
+  </w:abstractNum>
+  <w:abstractNum w:abstractNumId="6" w15:restartNumberingAfterBreak="0">
     <w:nsid w:val="71AF06B1"/>
     <w:multiLevelType w:val="hybridMultilevel"/>
     <w:tmpl w:val="485C4DCA"/>
@@ -1289,39 +1100,128 @@
       </w:pPr>
     </w:lvl>
   </w:abstractNum>
-  <w:num w:numId="8">
+  <w:abstractNum w:abstractNumId="7" w15:restartNumberingAfterBreak="0">
+    <w:nsid w:val="7472A116"/>
+    <w:multiLevelType w:val="hybridMultilevel"/>
+    <w:tmpl w:val="4FBC65C8"/>
+    <w:lvl w:ilvl="0" w:tplc="02E44F3A">
+      <w:start w:val="5"/>
+      <w:numFmt w:val="decimal"/>
+      <w:lvlText w:val="%1."/>
+      <w:lvlJc w:val="left"/>
+      <w:pPr>
+        <w:ind w:left="720" w:hanging="360"/>
+      </w:pPr>
+      <w:rPr>
+        <w:rFonts w:ascii="Times New Roman" w:hAnsi="Times New Roman" w:hint="default"/>
+      </w:rPr>
+    </w:lvl>
+    <w:lvl w:ilvl="1" w:tplc="B7BC5140">
+      <w:start w:val="1"/>
+      <w:numFmt w:val="lowerLetter"/>
+      <w:lvlText w:val="%2."/>
+      <w:lvlJc w:val="left"/>
+      <w:pPr>
+        <w:ind w:left="1440" w:hanging="360"/>
+      </w:pPr>
+    </w:lvl>
+    <w:lvl w:ilvl="2" w:tplc="57EA1030">
+      <w:start w:val="1"/>
+      <w:numFmt w:val="lowerRoman"/>
+      <w:lvlText w:val="%3."/>
+      <w:lvlJc w:val="right"/>
+      <w:pPr>
+        <w:ind w:left="2160" w:hanging="180"/>
+      </w:pPr>
+    </w:lvl>
+    <w:lvl w:ilvl="3" w:tplc="4D66D444">
+      <w:start w:val="1"/>
+      <w:numFmt w:val="decimal"/>
+      <w:lvlText w:val="%4."/>
+      <w:lvlJc w:val="left"/>
+      <w:pPr>
+        <w:ind w:left="2880" w:hanging="360"/>
+      </w:pPr>
+    </w:lvl>
+    <w:lvl w:ilvl="4" w:tplc="AA8A1508">
+      <w:start w:val="1"/>
+      <w:numFmt w:val="lowerLetter"/>
+      <w:lvlText w:val="%5."/>
+      <w:lvlJc w:val="left"/>
+      <w:pPr>
+        <w:ind w:left="3600" w:hanging="360"/>
+      </w:pPr>
+    </w:lvl>
+    <w:lvl w:ilvl="5" w:tplc="49581AD2">
+      <w:start w:val="1"/>
+      <w:numFmt w:val="lowerRoman"/>
+      <w:lvlText w:val="%6."/>
+      <w:lvlJc w:val="right"/>
+      <w:pPr>
+        <w:ind w:left="4320" w:hanging="180"/>
+      </w:pPr>
+    </w:lvl>
+    <w:lvl w:ilvl="6" w:tplc="6E9CCBAA">
+      <w:start w:val="1"/>
+      <w:numFmt w:val="decimal"/>
+      <w:lvlText w:val="%7."/>
+      <w:lvlJc w:val="left"/>
+      <w:pPr>
+        <w:ind w:left="5040" w:hanging="360"/>
+      </w:pPr>
+    </w:lvl>
+    <w:lvl w:ilvl="7" w:tplc="DADEF362">
+      <w:start w:val="1"/>
+      <w:numFmt w:val="lowerLetter"/>
+      <w:lvlText w:val="%8."/>
+      <w:lvlJc w:val="left"/>
+      <w:pPr>
+        <w:ind w:left="5760" w:hanging="360"/>
+      </w:pPr>
+    </w:lvl>
+    <w:lvl w:ilvl="8" w:tplc="B3FEC7D0">
+      <w:start w:val="1"/>
+      <w:numFmt w:val="lowerRoman"/>
+      <w:lvlText w:val="%9."/>
+      <w:lvlJc w:val="right"/>
+      <w:pPr>
+        <w:ind w:left="6480" w:hanging="180"/>
+      </w:pPr>
+    </w:lvl>
+  </w:abstractNum>
+  <w:num w:numId="1" w16cid:durableId="1753040634">
+    <w:abstractNumId w:val="3"/>
+  </w:num>
+  <w:num w:numId="2" w16cid:durableId="808472243">
+    <w:abstractNumId w:val="2"/>
+  </w:num>
+  <w:num w:numId="3" w16cid:durableId="1187871844">
+    <w:abstractNumId w:val="5"/>
+  </w:num>
+  <w:num w:numId="4" w16cid:durableId="1239442063">
+    <w:abstractNumId w:val="0"/>
+  </w:num>
+  <w:num w:numId="5" w16cid:durableId="859930233">
     <w:abstractNumId w:val="7"/>
   </w:num>
-  <w:num w:numId="7">
-    <w:abstractNumId w:val="6"/>
-  </w:num>
-  <w:num w:numId="6">
-    <w:abstractNumId w:val="5"/>
-  </w:num>
-  <w:num w:numId="5">
+  <w:num w:numId="6" w16cid:durableId="1746798452">
     <w:abstractNumId w:val="4"/>
   </w:num>
-  <w:num w:numId="4">
-    <w:abstractNumId w:val="3"/>
+  <w:num w:numId="7" w16cid:durableId="731005035">
+    <w:abstractNumId w:val="1"/>
   </w:num>
-  <w:num w:numId="3">
-    <w:abstractNumId w:val="2"/>
-  </w:num>
-  <w:num w:numId="1" w16cid:durableId="731005035">
-    <w:abstractNumId w:val="0"/>
-  </w:num>
-  <w:num w:numId="2" w16cid:durableId="1670596953">
-    <w:abstractNumId w:val="1"/>
+  <w:num w:numId="8" w16cid:durableId="1670596953">
+    <w:abstractNumId w:val="6"/>
   </w:num>
 </w:numbering>
 </file>
 
 <file path=word/styles.xml><?xml version="1.0" encoding="utf-8"?>
-<w:styles xmlns:mc="http://schemas.openxmlformats.org/markup-compatibility/2006" xmlns:r="http://schemas.openxmlformats.org/officeDocument/2006/relationships" xmlns:w="http://schemas.openxmlformats.org/wordprocessingml/2006/main" xmlns:w14="http://schemas.microsoft.com/office/word/2010/wordml" xmlns:w15="http://schemas.microsoft.com/office/word/2012/wordml" xmlns:w16cex="http://schemas.microsoft.com/office/word/2018/wordml/cex" xmlns:w16cid="http://schemas.microsoft.com/office/word/2016/wordml/cid" xmlns:w16="http://schemas.microsoft.com/office/word/2018/wordml" xmlns:w16sdtdh="http://schemas.microsoft.com/office/word/2020/wordml/sdtdatahash" xmlns:w16sdtfl="http://schemas.microsoft.com/office/word/2024/wordml/sdtformatlock" xmlns:w16se="http://schemas.microsoft.com/office/word/2015/wordml/symex" xmlns:w16du="http://schemas.microsoft.com/office/word/2023/wordml/word16du" mc:Ignorable="w14 w15 w16se w16cid w16 w16cex w16sdtdh w16sdtfl w16du">
+<w:styles xmlns:mc="http://schemas.openxmlformats.org/markup-compatibility/2006" xmlns:r="http://schemas.openxmlformats.org/officeDocument/2006/relationships" xmlns:w="http://schemas.openxmlformats.org/wordprocessingml/2006/main" xmlns:w14="http://schemas.microsoft.com/office/word/2010/wordml" xmlns:w15="http://schemas.microsoft.com/office/word/2012/wordml" xmlns:w16cex="http://schemas.microsoft.com/office/word/2018/wordml/cex" xmlns:w16cid="http://schemas.microsoft.com/office/word/2016/wordml/cid" xmlns:w16="http://schemas.microsoft.com/office/word/2018/wordml" xmlns:w16du="http://schemas.microsoft.com/office/word/2023/wordml/word16du" xmlns:w16sdtdh="http://schemas.microsoft.com/office/word/2020/wordml/sdtdatahash" xmlns:w16sdtfl="http://schemas.microsoft.com/office/word/2024/wordml/sdtformatlock" xmlns:w16se="http://schemas.microsoft.com/office/word/2015/wordml/symex" mc:Ignorable="w14 w15 w16se w16cid w16 w16cex w16sdtdh w16sdtfl w16du">
   <w:docDefaults>
     <w:rPrDefault>
       <w:rPr>
-        <w:rFonts w:asciiTheme="minorHAnsi" w:hAnsiTheme="minorHAnsi" w:eastAsiaTheme="minorHAnsi" w:cstheme="minorBidi"/>
+        <w:rFonts w:asciiTheme="minorHAnsi" w:eastAsiaTheme="minorHAnsi" w:hAnsiTheme="minorHAnsi" w:cstheme="minorBidi"/>
         <w:kern w:val="2"/>
         <w:sz w:val="24"/>
         <w:szCs w:val="39"/>
@@ -1338,14 +1238,14 @@
   <w:latentStyles w:defLockedState="0" w:defUIPriority="99" w:defSemiHidden="0" w:defUnhideWhenUsed="0" w:defQFormat="0" w:count="376">
     <w:lsdException w:name="Normal" w:uiPriority="0" w:qFormat="1"/>
     <w:lsdException w:name="heading 1" w:uiPriority="9" w:qFormat="1"/>
-    <w:lsdException w:name="heading 2" w:uiPriority="9" w:semiHidden="1" w:unhideWhenUsed="1" w:qFormat="1"/>
-    <w:lsdException w:name="heading 3" w:uiPriority="9" w:semiHidden="1" w:unhideWhenUsed="1" w:qFormat="1"/>
-    <w:lsdException w:name="heading 4" w:uiPriority="9" w:semiHidden="1" w:unhideWhenUsed="1" w:qFormat="1"/>
-    <w:lsdException w:name="heading 5" w:uiPriority="9" w:semiHidden="1" w:unhideWhenUsed="1" w:qFormat="1"/>
-    <w:lsdException w:name="heading 6" w:uiPriority="9" w:semiHidden="1" w:unhideWhenUsed="1" w:qFormat="1"/>
-    <w:lsdException w:name="heading 7" w:uiPriority="9" w:semiHidden="1" w:unhideWhenUsed="1" w:qFormat="1"/>
-    <w:lsdException w:name="heading 8" w:uiPriority="9" w:semiHidden="1" w:unhideWhenUsed="1" w:qFormat="1"/>
-    <w:lsdException w:name="heading 9" w:uiPriority="9" w:semiHidden="1" w:unhideWhenUsed="1" w:qFormat="1"/>
+    <w:lsdException w:name="heading 2" w:semiHidden="1" w:uiPriority="9" w:unhideWhenUsed="1" w:qFormat="1"/>
+    <w:lsdException w:name="heading 3" w:semiHidden="1" w:uiPriority="9" w:unhideWhenUsed="1" w:qFormat="1"/>
+    <w:lsdException w:name="heading 4" w:semiHidden="1" w:uiPriority="9" w:unhideWhenUsed="1" w:qFormat="1"/>
+    <w:lsdException w:name="heading 5" w:semiHidden="1" w:uiPriority="9" w:unhideWhenUsed="1" w:qFormat="1"/>
+    <w:lsdException w:name="heading 6" w:semiHidden="1" w:uiPriority="9" w:unhideWhenUsed="1" w:qFormat="1"/>
+    <w:lsdException w:name="heading 7" w:semiHidden="1" w:uiPriority="9" w:unhideWhenUsed="1" w:qFormat="1"/>
+    <w:lsdException w:name="heading 8" w:semiHidden="1" w:uiPriority="9" w:unhideWhenUsed="1" w:qFormat="1"/>
+    <w:lsdException w:name="heading 9" w:semiHidden="1" w:uiPriority="9" w:unhideWhenUsed="1" w:qFormat="1"/>
     <w:lsdException w:name="index 1" w:semiHidden="1" w:unhideWhenUsed="1"/>
     <w:lsdException w:name="index 2" w:semiHidden="1" w:unhideWhenUsed="1"/>
     <w:lsdException w:name="index 3" w:semiHidden="1" w:unhideWhenUsed="1"/>
@@ -1355,22 +1255,22 @@
     <w:lsdException w:name="index 7" w:semiHidden="1" w:unhideWhenUsed="1"/>
     <w:lsdException w:name="index 8" w:semiHidden="1" w:unhideWhenUsed="1"/>
     <w:lsdException w:name="index 9" w:semiHidden="1" w:unhideWhenUsed="1"/>
-    <w:lsdException w:name="toc 1" w:uiPriority="39" w:semiHidden="1" w:unhideWhenUsed="1"/>
-    <w:lsdException w:name="toc 2" w:uiPriority="39" w:semiHidden="1" w:unhideWhenUsed="1"/>
-    <w:lsdException w:name="toc 3" w:uiPriority="39" w:semiHidden="1" w:unhideWhenUsed="1"/>
-    <w:lsdException w:name="toc 4" w:uiPriority="39" w:semiHidden="1" w:unhideWhenUsed="1"/>
-    <w:lsdException w:name="toc 5" w:uiPriority="39" w:semiHidden="1" w:unhideWhenUsed="1"/>
-    <w:lsdException w:name="toc 6" w:uiPriority="39" w:semiHidden="1" w:unhideWhenUsed="1"/>
-    <w:lsdException w:name="toc 7" w:uiPriority="39" w:semiHidden="1" w:unhideWhenUsed="1"/>
-    <w:lsdException w:name="toc 8" w:uiPriority="39" w:semiHidden="1" w:unhideWhenUsed="1"/>
-    <w:lsdException w:name="toc 9" w:uiPriority="39" w:semiHidden="1" w:unhideWhenUsed="1"/>
+    <w:lsdException w:name="toc 1" w:semiHidden="1" w:uiPriority="39" w:unhideWhenUsed="1"/>
+    <w:lsdException w:name="toc 2" w:semiHidden="1" w:uiPriority="39" w:unhideWhenUsed="1"/>
+    <w:lsdException w:name="toc 3" w:semiHidden="1" w:uiPriority="39" w:unhideWhenUsed="1"/>
+    <w:lsdException w:name="toc 4" w:semiHidden="1" w:uiPriority="39" w:unhideWhenUsed="1"/>
+    <w:lsdException w:name="toc 5" w:semiHidden="1" w:uiPriority="39" w:unhideWhenUsed="1"/>
+    <w:lsdException w:name="toc 6" w:semiHidden="1" w:uiPriority="39" w:unhideWhenUsed="1"/>
+    <w:lsdException w:name="toc 7" w:semiHidden="1" w:uiPriority="39" w:unhideWhenUsed="1"/>
+    <w:lsdException w:name="toc 8" w:semiHidden="1" w:uiPriority="39" w:unhideWhenUsed="1"/>
+    <w:lsdException w:name="toc 9" w:semiHidden="1" w:uiPriority="39" w:unhideWhenUsed="1"/>
     <w:lsdException w:name="Normal Indent" w:semiHidden="1" w:unhideWhenUsed="1"/>
     <w:lsdException w:name="footnote text" w:semiHidden="1" w:unhideWhenUsed="1"/>
     <w:lsdException w:name="annotation text" w:semiHidden="1" w:unhideWhenUsed="1"/>
     <w:lsdException w:name="header" w:semiHidden="1" w:unhideWhenUsed="1"/>
     <w:lsdException w:name="footer" w:semiHidden="1" w:unhideWhenUsed="1"/>
     <w:lsdException w:name="index heading" w:semiHidden="1" w:unhideWhenUsed="1"/>
-    <w:lsdException w:name="caption" w:uiPriority="35" w:semiHidden="1" w:unhideWhenUsed="1" w:qFormat="1"/>
+    <w:lsdException w:name="caption" w:semiHidden="1" w:uiPriority="35" w:unhideWhenUsed="1" w:qFormat="1"/>
     <w:lsdException w:name="table of figures" w:semiHidden="1" w:unhideWhenUsed="1"/>
     <w:lsdException w:name="envelope address" w:semiHidden="1" w:unhideWhenUsed="1"/>
     <w:lsdException w:name="envelope return" w:semiHidden="1" w:unhideWhenUsed="1"/>
@@ -1401,7 +1301,7 @@
     <w:lsdException w:name="Title" w:uiPriority="10" w:qFormat="1"/>
     <w:lsdException w:name="Closing" w:semiHidden="1" w:unhideWhenUsed="1"/>
     <w:lsdException w:name="Signature" w:semiHidden="1" w:unhideWhenUsed="1"/>
-    <w:lsdException w:name="Default Paragraph Font" w:uiPriority="1" w:semiHidden="1" w:unhideWhenUsed="1"/>
+    <w:lsdException w:name="Default Paragraph Font" w:semiHidden="1" w:uiPriority="1" w:unhideWhenUsed="1"/>
     <w:lsdException w:name="Body Text" w:semiHidden="1" w:unhideWhenUsed="1"/>
     <w:lsdException w:name="Body Text Indent" w:semiHidden="1" w:unhideWhenUsed="1"/>
     <w:lsdException w:name="List Continue" w:semiHidden="1" w:unhideWhenUsed="1"/>
@@ -1601,8 +1501,8 @@
     <w:lsdException w:name="Subtle Reference" w:uiPriority="31" w:qFormat="1"/>
     <w:lsdException w:name="Intense Reference" w:uiPriority="32" w:qFormat="1"/>
     <w:lsdException w:name="Book Title" w:uiPriority="33" w:qFormat="1"/>
-    <w:lsdException w:name="Bibliography" w:uiPriority="37" w:semiHidden="1" w:unhideWhenUsed="1"/>
-    <w:lsdException w:name="TOC Heading" w:uiPriority="39" w:semiHidden="1" w:unhideWhenUsed="1" w:qFormat="1"/>
+    <w:lsdException w:name="Bibliography" w:semiHidden="1" w:uiPriority="37" w:unhideWhenUsed="1"/>
+    <w:lsdException w:name="TOC Heading" w:semiHidden="1" w:uiPriority="39" w:unhideWhenUsed="1" w:qFormat="1"/>
     <w:lsdException w:name="Plain Table 1" w:uiPriority="41"/>
     <w:lsdException w:name="Plain Table 2" w:uiPriority="42"/>
     <w:lsdException w:name="Plain Table 3" w:uiPriority="43"/>
@@ -1713,7 +1613,7 @@
     <w:lsdException w:name="Unresolved Mention" w:semiHidden="1" w:unhideWhenUsed="1"/>
     <w:lsdException w:name="Smart Link" w:semiHidden="1" w:unhideWhenUsed="1"/>
   </w:latentStyles>
-  <w:style w:type="paragraph" w:styleId="Normal" w:default="1">
+  <w:style w:type="paragraph" w:default="1" w:styleId="Normal">
     <w:name w:val="Normal"/>
     <w:qFormat/>
     <w:rPr>
@@ -1735,7 +1635,7 @@
       <w:outlineLvl w:val="0"/>
     </w:pPr>
     <w:rPr>
-      <w:rFonts w:asciiTheme="majorHAnsi" w:hAnsiTheme="majorHAnsi" w:eastAsiaTheme="majorEastAsia" w:cstheme="majorBidi"/>
+      <w:rFonts w:asciiTheme="majorHAnsi" w:eastAsiaTheme="majorEastAsia" w:hAnsiTheme="majorHAnsi" w:cstheme="majorBidi"/>
       <w:color w:val="0F4761" w:themeColor="accent1" w:themeShade="BF"/>
       <w:sz w:val="40"/>
       <w:szCs w:val="65"/>
@@ -1758,7 +1658,7 @@
       <w:outlineLvl w:val="1"/>
     </w:pPr>
     <w:rPr>
-      <w:rFonts w:asciiTheme="majorHAnsi" w:hAnsiTheme="majorHAnsi" w:eastAsiaTheme="majorEastAsia" w:cstheme="majorBidi"/>
+      <w:rFonts w:asciiTheme="majorHAnsi" w:eastAsiaTheme="majorEastAsia" w:hAnsiTheme="majorHAnsi" w:cstheme="majorBidi"/>
       <w:color w:val="0F4761" w:themeColor="accent1" w:themeShade="BF"/>
       <w:sz w:val="32"/>
       <w:szCs w:val="52"/>
@@ -1919,13 +1819,13 @@
       <w:color w:val="272727" w:themeColor="text1" w:themeTint="D8"/>
     </w:rPr>
   </w:style>
-  <w:style w:type="character" w:styleId="DefaultParagraphFont" w:default="1">
+  <w:style w:type="character" w:default="1" w:styleId="DefaultParagraphFont">
     <w:name w:val="Default Paragraph Font"/>
     <w:uiPriority w:val="1"/>
     <w:semiHidden/>
     <w:unhideWhenUsed/>
   </w:style>
-  <w:style w:type="table" w:styleId="TableNormal" w:default="1">
+  <w:style w:type="table" w:default="1" w:styleId="TableNormal">
     <w:name w:val="Normal Table"/>
     <w:uiPriority w:val="99"/>
     <w:semiHidden/>
@@ -1940,26 +1840,26 @@
       </w:tblCellMar>
     </w:tblPr>
   </w:style>
-  <w:style w:type="numbering" w:styleId="NoList" w:default="1">
+  <w:style w:type="numbering" w:default="1" w:styleId="NoList">
     <w:name w:val="No List"/>
     <w:uiPriority w:val="99"/>
     <w:semiHidden/>
     <w:unhideWhenUsed/>
   </w:style>
-  <w:style w:type="character" w:styleId="Heading1Char" w:customStyle="1">
+  <w:style w:type="character" w:customStyle="1" w:styleId="Heading1Char">
     <w:name w:val="Heading 1 Char"/>
     <w:basedOn w:val="DefaultParagraphFont"/>
     <w:link w:val="Heading1"/>
     <w:uiPriority w:val="9"/>
     <w:rsid w:val="00D077A6"/>
     <w:rPr>
-      <w:rFonts w:asciiTheme="majorHAnsi" w:hAnsiTheme="majorHAnsi" w:eastAsiaTheme="majorEastAsia" w:cstheme="majorBidi"/>
+      <w:rFonts w:asciiTheme="majorHAnsi" w:eastAsiaTheme="majorEastAsia" w:hAnsiTheme="majorHAnsi" w:cstheme="majorBidi"/>
       <w:color w:val="0F4761" w:themeColor="accent1" w:themeShade="BF"/>
       <w:sz w:val="40"/>
       <w:szCs w:val="65"/>
     </w:rPr>
   </w:style>
-  <w:style w:type="character" w:styleId="Heading2Char" w:customStyle="1">
+  <w:style w:type="character" w:customStyle="1" w:styleId="Heading2Char">
     <w:name w:val="Heading 2 Char"/>
     <w:basedOn w:val="DefaultParagraphFont"/>
     <w:link w:val="Heading2"/>
@@ -1967,13 +1867,13 @@
     <w:semiHidden/>
     <w:rsid w:val="00D077A6"/>
     <w:rPr>
-      <w:rFonts w:asciiTheme="majorHAnsi" w:hAnsiTheme="majorHAnsi" w:eastAsiaTheme="majorEastAsia" w:cstheme="majorBidi"/>
+      <w:rFonts w:asciiTheme="majorHAnsi" w:eastAsiaTheme="majorEastAsia" w:hAnsiTheme="majorHAnsi" w:cstheme="majorBidi"/>
       <w:color w:val="0F4761" w:themeColor="accent1" w:themeShade="BF"/>
       <w:sz w:val="32"/>
       <w:szCs w:val="52"/>
     </w:rPr>
   </w:style>
-  <w:style w:type="character" w:styleId="Heading3Char" w:customStyle="1">
+  <w:style w:type="character" w:customStyle="1" w:styleId="Heading3Char">
     <w:name w:val="Heading 3 Char"/>
     <w:basedOn w:val="DefaultParagraphFont"/>
     <w:link w:val="Heading3"/>
@@ -1987,7 +1887,7 @@
       <w:szCs w:val="45"/>
     </w:rPr>
   </w:style>
-  <w:style w:type="character" w:styleId="Heading4Char" w:customStyle="1">
+  <w:style w:type="character" w:customStyle="1" w:styleId="Heading4Char">
     <w:name w:val="Heading 4 Char"/>
     <w:basedOn w:val="DefaultParagraphFont"/>
     <w:link w:val="Heading4"/>
@@ -2001,7 +1901,7 @@
       <w:color w:val="0F4761" w:themeColor="accent1" w:themeShade="BF"/>
     </w:rPr>
   </w:style>
-  <w:style w:type="character" w:styleId="Heading5Char" w:customStyle="1">
+  <w:style w:type="character" w:customStyle="1" w:styleId="Heading5Char">
     <w:name w:val="Heading 5 Char"/>
     <w:basedOn w:val="DefaultParagraphFont"/>
     <w:link w:val="Heading5"/>
@@ -2013,7 +1913,7 @@
       <w:color w:val="0F4761" w:themeColor="accent1" w:themeShade="BF"/>
     </w:rPr>
   </w:style>
-  <w:style w:type="character" w:styleId="Heading6Char" w:customStyle="1">
+  <w:style w:type="character" w:customStyle="1" w:styleId="Heading6Char">
     <w:name w:val="Heading 6 Char"/>
     <w:basedOn w:val="DefaultParagraphFont"/>
     <w:link w:val="Heading6"/>
@@ -2027,7 +1927,7 @@
       <w:color w:val="595959" w:themeColor="text1" w:themeTint="A6"/>
     </w:rPr>
   </w:style>
-  <w:style w:type="character" w:styleId="Heading7Char" w:customStyle="1">
+  <w:style w:type="character" w:customStyle="1" w:styleId="Heading7Char">
     <w:name w:val="Heading 7 Char"/>
     <w:basedOn w:val="DefaultParagraphFont"/>
     <w:link w:val="Heading7"/>
@@ -2039,7 +1939,7 @@
       <w:color w:val="595959" w:themeColor="text1" w:themeTint="A6"/>
     </w:rPr>
   </w:style>
-  <w:style w:type="character" w:styleId="Heading8Char" w:customStyle="1">
+  <w:style w:type="character" w:customStyle="1" w:styleId="Heading8Char">
     <w:name w:val="Heading 8 Char"/>
     <w:basedOn w:val="DefaultParagraphFont"/>
     <w:link w:val="Heading8"/>
@@ -2053,7 +1953,7 @@
       <w:color w:val="272727" w:themeColor="text1" w:themeTint="D8"/>
     </w:rPr>
   </w:style>
-  <w:style w:type="character" w:styleId="Heading9Char" w:customStyle="1">
+  <w:style w:type="character" w:customStyle="1" w:styleId="Heading9Char">
     <w:name w:val="Heading 9 Char"/>
     <w:basedOn w:val="DefaultParagraphFont"/>
     <w:link w:val="Heading9"/>
@@ -2078,21 +1978,21 @@
       <w:contextualSpacing/>
     </w:pPr>
     <w:rPr>
-      <w:rFonts w:asciiTheme="majorHAnsi" w:hAnsiTheme="majorHAnsi" w:eastAsiaTheme="majorEastAsia" w:cstheme="majorBidi"/>
+      <w:rFonts w:asciiTheme="majorHAnsi" w:eastAsiaTheme="majorEastAsia" w:hAnsiTheme="majorHAnsi" w:cstheme="majorBidi"/>
       <w:spacing w:val="-10"/>
       <w:kern w:val="28"/>
       <w:sz w:val="56"/>
       <w:szCs w:val="91"/>
     </w:rPr>
   </w:style>
-  <w:style w:type="character" w:styleId="TitleChar" w:customStyle="1">
+  <w:style w:type="character" w:customStyle="1" w:styleId="TitleChar">
     <w:name w:val="Title Char"/>
     <w:basedOn w:val="DefaultParagraphFont"/>
     <w:link w:val="Title"/>
     <w:uiPriority w:val="10"/>
     <w:rsid w:val="00D077A6"/>
     <w:rPr>
-      <w:rFonts w:asciiTheme="majorHAnsi" w:hAnsiTheme="majorHAnsi" w:eastAsiaTheme="majorEastAsia" w:cstheme="majorBidi"/>
+      <w:rFonts w:asciiTheme="majorHAnsi" w:eastAsiaTheme="majorEastAsia" w:hAnsiTheme="majorHAnsi" w:cstheme="majorBidi"/>
       <w:spacing w:val="-10"/>
       <w:kern w:val="28"/>
       <w:sz w:val="56"/>
@@ -2120,7 +2020,7 @@
       <w:szCs w:val="45"/>
     </w:rPr>
   </w:style>
-  <w:style w:type="character" w:styleId="SubtitleChar" w:customStyle="1">
+  <w:style w:type="character" w:customStyle="1" w:styleId="SubtitleChar">
     <w:name w:val="Subtitle Char"/>
     <w:basedOn w:val="DefaultParagraphFont"/>
     <w:link w:val="Subtitle"/>
@@ -2152,7 +2052,7 @@
       <w:color w:val="404040" w:themeColor="text1" w:themeTint="BF"/>
     </w:rPr>
   </w:style>
-  <w:style w:type="character" w:styleId="QuoteChar" w:customStyle="1">
+  <w:style w:type="character" w:customStyle="1" w:styleId="QuoteChar">
     <w:name w:val="Quote Char"/>
     <w:basedOn w:val="DefaultParagraphFont"/>
     <w:link w:val="Quote"/>
@@ -2198,8 +2098,8 @@
     <w:rsid w:val="00D077A6"/>
     <w:pPr>
       <w:pBdr>
-        <w:top w:val="single" w:color="0F4761" w:themeColor="accent1" w:themeShade="BF" w:sz="4" w:space="10"/>
-        <w:bottom w:val="single" w:color="0F4761" w:themeColor="accent1" w:themeShade="BF" w:sz="4" w:space="10"/>
+        <w:top w:val="single" w:sz="4" w:space="10" w:color="0F4761" w:themeColor="accent1" w:themeShade="BF"/>
+        <w:bottom w:val="single" w:sz="4" w:space="10" w:color="0F4761" w:themeColor="accent1" w:themeShade="BF"/>
       </w:pBdr>
       <w:spacing w:before="360" w:after="360"/>
       <w:ind w:left="864" w:right="864"/>
@@ -2211,7 +2111,7 @@
       <w:color w:val="0F4761" w:themeColor="accent1" w:themeShade="BF"/>
     </w:rPr>
   </w:style>
-  <w:style w:type="character" w:styleId="IntenseQuoteChar" w:customStyle="1">
+  <w:style w:type="character" w:customStyle="1" w:styleId="IntenseQuoteChar">
     <w:name w:val="Intense Quote Char"/>
     <w:basedOn w:val="DefaultParagraphFont"/>
     <w:link w:val="IntenseQuote"/>
@@ -2253,7 +2153,7 @@
 </file>
 
 <file path=word/theme/theme1.xml><?xml version="1.0" encoding="utf-8"?>
-<a:theme xmlns:a="http://schemas.openxmlformats.org/drawingml/2006/main" xmlns:thm15="http://schemas.microsoft.com/office/thememl/2012/main" name="Office Theme">
+<a:theme xmlns:a="http://schemas.openxmlformats.org/drawingml/2006/main" name="Office Theme">
   <a:themeElements>
     <a:clrScheme name="Office">
       <a:dk1>

</xml_diff>